<commit_message>
ADD commantaire au code
</commit_message>
<xml_diff>
--- a/T-P_OO-Rapport_de_projet.docx
+++ b/T-P_OO-Rapport_de_projet.docx
@@ -3695,7 +3695,7 @@
         <w:pStyle w:val="Retraitcorpsdetexte"/>
         <w:numPr>
           <w:ilvl w:val="0"/>
-          <w:numId w:val="14"/>
+          <w:numId w:val="5"/>
         </w:numPr>
       </w:pPr>
       <w:r>
@@ -3707,7 +3707,7 @@
         <w:pStyle w:val="Retraitcorpsdetexte"/>
         <w:numPr>
           <w:ilvl w:val="0"/>
-          <w:numId w:val="14"/>
+          <w:numId w:val="5"/>
         </w:numPr>
       </w:pPr>
       <w:r>
@@ -3719,7 +3719,7 @@
         <w:pStyle w:val="Retraitcorpsdetexte"/>
         <w:numPr>
           <w:ilvl w:val="0"/>
-          <w:numId w:val="14"/>
+          <w:numId w:val="5"/>
         </w:numPr>
       </w:pPr>
       <w:r>
@@ -3731,7 +3731,7 @@
         <w:pStyle w:val="Retraitcorpsdetexte"/>
         <w:numPr>
           <w:ilvl w:val="0"/>
-          <w:numId w:val="14"/>
+          <w:numId w:val="5"/>
         </w:numPr>
       </w:pPr>
       <w:r>
@@ -3743,7 +3743,7 @@
         <w:pStyle w:val="Retraitcorpsdetexte"/>
         <w:numPr>
           <w:ilvl w:val="0"/>
-          <w:numId w:val="14"/>
+          <w:numId w:val="5"/>
         </w:numPr>
       </w:pPr>
       <w:r>
@@ -3765,7 +3765,7 @@
         <w:pStyle w:val="Retraitcorpsdetexte"/>
         <w:numPr>
           <w:ilvl w:val="0"/>
-          <w:numId w:val="14"/>
+          <w:numId w:val="5"/>
         </w:numPr>
       </w:pPr>
       <w:r>
@@ -3777,7 +3777,7 @@
         <w:pStyle w:val="Retraitcorpsdetexte"/>
         <w:numPr>
           <w:ilvl w:val="0"/>
-          <w:numId w:val="14"/>
+          <w:numId w:val="5"/>
         </w:numPr>
       </w:pPr>
       <w:r>
@@ -3789,7 +3789,7 @@
         <w:pStyle w:val="Retraitcorpsdetexte"/>
         <w:numPr>
           <w:ilvl w:val="0"/>
-          <w:numId w:val="14"/>
+          <w:numId w:val="5"/>
         </w:numPr>
       </w:pPr>
       <w:r>
@@ -4112,11 +4112,16 @@
     </w:p>
     <w:p>
       <w:pPr>
-        <w:pStyle w:val="Retraitcorpsdetexte"/>
-      </w:pPr>
+        <w:pStyle w:val="Titre2"/>
+      </w:pPr>
+      <w:proofErr w:type="gramStart"/>
       <w:r>
         <w:lastRenderedPageBreak/>
-        <w:t xml:space="preserve">4 classes structurent le domaine : </w:t>
+        <w:t>classes</w:t>
+      </w:r>
+      <w:proofErr w:type="gramEnd"/>
+      <w:r>
+        <w:t xml:space="preserve"> structurent le domaine : </w:t>
       </w:r>
     </w:p>
     <w:p>
@@ -4124,7 +4129,7 @@
         <w:pStyle w:val="Retraitcorpsdetexte"/>
         <w:numPr>
           <w:ilvl w:val="0"/>
-          <w:numId w:val="48"/>
+          <w:numId w:val="9"/>
         </w:numPr>
       </w:pPr>
       <w:r>
@@ -4132,11 +4137,13 @@
           <w:b/>
           <w:bCs/>
         </w:rPr>
-        <w:t>Parking</w:t>
-      </w:r>
-      <w:r>
-        <w:t xml:space="preserve"> (gestion des places et de l'historique)</w:t>
-      </w:r>
+        <w:t>Parking (gestion des places et du menu)</w:t>
+      </w:r>
+    </w:p>
+    <w:p>
+      <w:pPr>
+        <w:pStyle w:val="Retraitcorpsdetexte"/>
+      </w:pPr>
     </w:p>
     <w:tbl>
       <w:tblPr>
@@ -4151,16 +4158,25 @@
       </w:tblGrid>
       <w:tr>
         <w:trPr>
+          <w:cantSplit/>
           <w:trHeight w:val="260"/>
         </w:trPr>
         <w:tc>
           <w:tcPr>
             <w:tcW w:w="3056" w:type="dxa"/>
+            <w:tcBorders>
+              <w:top w:val="single" w:sz="4" w:space="0" w:color="auto"/>
+              <w:left w:val="single" w:sz="4" w:space="0" w:color="auto"/>
+              <w:bottom w:val="single" w:sz="4" w:space="0" w:color="auto"/>
+              <w:right w:val="single" w:sz="4" w:space="0" w:color="auto"/>
+            </w:tcBorders>
+            <w:hideMark/>
           </w:tcPr>
           <w:p>
             <w:pPr>
               <w:pStyle w:val="Retraitcorpsdetexte"/>
               <w:ind w:left="0"/>
+              <w:jc w:val="left"/>
               <w:rPr>
                 <w:b/>
                 <w:bCs/>
@@ -4171,18 +4187,26 @@
                 <w:b/>
                 <w:bCs/>
               </w:rPr>
-              <w:t>classe</w:t>
+              <w:t>Attribut</w:t>
             </w:r>
           </w:p>
         </w:tc>
         <w:tc>
           <w:tcPr>
             <w:tcW w:w="2878" w:type="dxa"/>
+            <w:tcBorders>
+              <w:top w:val="single" w:sz="4" w:space="0" w:color="auto"/>
+              <w:left w:val="single" w:sz="4" w:space="0" w:color="auto"/>
+              <w:bottom w:val="single" w:sz="4" w:space="0" w:color="auto"/>
+              <w:right w:val="single" w:sz="4" w:space="0" w:color="auto"/>
+            </w:tcBorders>
+            <w:hideMark/>
           </w:tcPr>
           <w:p>
             <w:pPr>
               <w:pStyle w:val="Retraitcorpsdetexte"/>
               <w:ind w:left="0"/>
+              <w:jc w:val="left"/>
               <w:rPr>
                 <w:b/>
                 <w:bCs/>
@@ -4193,73 +4217,124 @@
                 <w:b/>
                 <w:bCs/>
               </w:rPr>
-              <w:t>attribu</w:t>
+              <w:t>Type</w:t>
             </w:r>
           </w:p>
         </w:tc>
       </w:tr>
       <w:tr>
         <w:trPr>
+          <w:cantSplit/>
           <w:trHeight w:val="260"/>
         </w:trPr>
         <w:tc>
           <w:tcPr>
             <w:tcW w:w="3056" w:type="dxa"/>
+            <w:tcBorders>
+              <w:top w:val="single" w:sz="4" w:space="0" w:color="auto"/>
+              <w:left w:val="single" w:sz="4" w:space="0" w:color="auto"/>
+              <w:bottom w:val="single" w:sz="4" w:space="0" w:color="auto"/>
+              <w:right w:val="single" w:sz="4" w:space="0" w:color="auto"/>
+            </w:tcBorders>
+            <w:hideMark/>
           </w:tcPr>
           <w:p>
             <w:pPr>
               <w:pStyle w:val="Retraitcorpsdetexte"/>
               <w:ind w:left="0"/>
+              <w:jc w:val="left"/>
             </w:pPr>
             <w:r>
-              <w:t>PlaceParking</w:t>
+              <w:t>_places</w:t>
             </w:r>
           </w:p>
         </w:tc>
         <w:tc>
           <w:tcPr>
             <w:tcW w:w="2878" w:type="dxa"/>
+            <w:tcBorders>
+              <w:top w:val="single" w:sz="4" w:space="0" w:color="auto"/>
+              <w:left w:val="single" w:sz="4" w:space="0" w:color="auto"/>
+              <w:bottom w:val="single" w:sz="4" w:space="0" w:color="auto"/>
+              <w:right w:val="single" w:sz="4" w:space="0" w:color="auto"/>
+            </w:tcBorders>
+            <w:hideMark/>
           </w:tcPr>
           <w:p>
             <w:pPr>
               <w:pStyle w:val="Retraitcorpsdetexte"/>
               <w:ind w:left="0"/>
+              <w:jc w:val="left"/>
             </w:pPr>
             <w:r>
-              <w:t>&lt;list&gt;placeparking</w:t>
+              <w:t>List&lt;</w:t>
+            </w:r>
+            <w:proofErr w:type="spellStart"/>
+            <w:r>
+              <w:t>PlaceParking</w:t>
+            </w:r>
+            <w:proofErr w:type="spellEnd"/>
+            <w:r>
+              <w:t>&gt;</w:t>
             </w:r>
           </w:p>
         </w:tc>
       </w:tr>
       <w:tr>
         <w:trPr>
+          <w:cantSplit/>
           <w:trHeight w:val="260"/>
         </w:trPr>
         <w:tc>
           <w:tcPr>
             <w:tcW w:w="3056" w:type="dxa"/>
+            <w:tcBorders>
+              <w:top w:val="single" w:sz="4" w:space="0" w:color="auto"/>
+              <w:left w:val="single" w:sz="4" w:space="0" w:color="auto"/>
+              <w:bottom w:val="single" w:sz="4" w:space="0" w:color="auto"/>
+              <w:right w:val="single" w:sz="4" w:space="0" w:color="auto"/>
+            </w:tcBorders>
+            <w:hideMark/>
           </w:tcPr>
           <w:p>
             <w:pPr>
               <w:pStyle w:val="Retraitcorpsdetexte"/>
               <w:ind w:left="0"/>
+              <w:jc w:val="left"/>
             </w:pPr>
+            <w:proofErr w:type="spellStart"/>
             <w:r>
-              <w:t>historique</w:t>
+              <w:t>MaxPlaces</w:t>
             </w:r>
+            <w:proofErr w:type="spellEnd"/>
           </w:p>
         </w:tc>
         <w:tc>
           <w:tcPr>
             <w:tcW w:w="2878" w:type="dxa"/>
+            <w:tcBorders>
+              <w:top w:val="single" w:sz="4" w:space="0" w:color="auto"/>
+              <w:left w:val="single" w:sz="4" w:space="0" w:color="auto"/>
+              <w:bottom w:val="single" w:sz="4" w:space="0" w:color="auto"/>
+              <w:right w:val="single" w:sz="4" w:space="0" w:color="auto"/>
+            </w:tcBorders>
+            <w:hideMark/>
           </w:tcPr>
           <w:p>
             <w:pPr>
               <w:pStyle w:val="Retraitcorpsdetexte"/>
               <w:ind w:left="0"/>
+              <w:jc w:val="left"/>
             </w:pPr>
+            <w:proofErr w:type="spellStart"/>
+            <w:proofErr w:type="gramStart"/>
             <w:r>
-              <w:t>&lt;string&gt; log vehicule + ticket</w:t>
+              <w:t>int</w:t>
+            </w:r>
+            <w:proofErr w:type="spellEnd"/>
+            <w:proofErr w:type="gramEnd"/>
+            <w:r>
+              <w:t xml:space="preserve"> (20)</w:t>
             </w:r>
           </w:p>
         </w:tc>
@@ -4269,6 +4344,7 @@
       <w:pPr>
         <w:pStyle w:val="Retraitcorpsdetexte"/>
         <w:ind w:left="2174"/>
+        <w:jc w:val="left"/>
       </w:pPr>
     </w:p>
     <w:p>
@@ -4276,9 +4352,11 @@
         <w:pStyle w:val="Retraitcorpsdetexte"/>
         <w:numPr>
           <w:ilvl w:val="0"/>
-          <w:numId w:val="48"/>
+          <w:numId w:val="6"/>
         </w:numPr>
-      </w:pPr>
+        <w:jc w:val="left"/>
+      </w:pPr>
+      <w:proofErr w:type="spellStart"/>
       <w:r>
         <w:rPr>
           <w:b/>
@@ -4286,6 +4364,7 @@
         </w:rPr>
         <w:t>PlaceParking</w:t>
       </w:r>
+      <w:proofErr w:type="spellEnd"/>
       <w:r>
         <w:t xml:space="preserve"> (véhicule, statut libre/occupée)</w:t>
       </w:r>
@@ -4303,16 +4382,25 @@
       </w:tblGrid>
       <w:tr>
         <w:trPr>
+          <w:cantSplit/>
           <w:trHeight w:val="260"/>
         </w:trPr>
         <w:tc>
           <w:tcPr>
             <w:tcW w:w="3056" w:type="dxa"/>
+            <w:tcBorders>
+              <w:top w:val="single" w:sz="4" w:space="0" w:color="auto"/>
+              <w:left w:val="single" w:sz="4" w:space="0" w:color="auto"/>
+              <w:bottom w:val="single" w:sz="4" w:space="0" w:color="auto"/>
+              <w:right w:val="single" w:sz="4" w:space="0" w:color="auto"/>
+            </w:tcBorders>
+            <w:hideMark/>
           </w:tcPr>
           <w:p>
             <w:pPr>
               <w:pStyle w:val="Retraitcorpsdetexte"/>
               <w:ind w:left="0"/>
+              <w:jc w:val="left"/>
               <w:rPr>
                 <w:b/>
                 <w:bCs/>
@@ -4323,18 +4411,26 @@
                 <w:b/>
                 <w:bCs/>
               </w:rPr>
-              <w:t>classe</w:t>
+              <w:t>Attribut</w:t>
             </w:r>
           </w:p>
         </w:tc>
         <w:tc>
           <w:tcPr>
             <w:tcW w:w="2878" w:type="dxa"/>
+            <w:tcBorders>
+              <w:top w:val="single" w:sz="4" w:space="0" w:color="auto"/>
+              <w:left w:val="single" w:sz="4" w:space="0" w:color="auto"/>
+              <w:bottom w:val="single" w:sz="4" w:space="0" w:color="auto"/>
+              <w:right w:val="single" w:sz="4" w:space="0" w:color="auto"/>
+            </w:tcBorders>
+            <w:hideMark/>
           </w:tcPr>
           <w:p>
             <w:pPr>
               <w:pStyle w:val="Retraitcorpsdetexte"/>
               <w:ind w:left="0"/>
+              <w:jc w:val="left"/>
               <w:rPr>
                 <w:b/>
                 <w:bCs/>
@@ -4345,107 +4441,174 @@
                 <w:b/>
                 <w:bCs/>
               </w:rPr>
-              <w:t>attribu</w:t>
+              <w:t>Type</w:t>
             </w:r>
           </w:p>
         </w:tc>
       </w:tr>
       <w:tr>
         <w:trPr>
+          <w:cantSplit/>
           <w:trHeight w:val="260"/>
         </w:trPr>
         <w:tc>
           <w:tcPr>
             <w:tcW w:w="3056" w:type="dxa"/>
+            <w:tcBorders>
+              <w:top w:val="single" w:sz="4" w:space="0" w:color="auto"/>
+              <w:left w:val="single" w:sz="4" w:space="0" w:color="auto"/>
+              <w:bottom w:val="single" w:sz="4" w:space="0" w:color="auto"/>
+              <w:right w:val="single" w:sz="4" w:space="0" w:color="auto"/>
+            </w:tcBorders>
+            <w:hideMark/>
           </w:tcPr>
           <w:p>
             <w:pPr>
               <w:pStyle w:val="Retraitcorpsdetexte"/>
               <w:ind w:left="0"/>
+              <w:jc w:val="left"/>
             </w:pPr>
+            <w:proofErr w:type="spellStart"/>
             <w:r>
-              <w:t>vehicule</w:t>
+              <w:t>Vehicule</w:t>
             </w:r>
+            <w:proofErr w:type="spellEnd"/>
           </w:p>
         </w:tc>
         <w:tc>
           <w:tcPr>
             <w:tcW w:w="2878" w:type="dxa"/>
+            <w:tcBorders>
+              <w:top w:val="single" w:sz="4" w:space="0" w:color="auto"/>
+              <w:left w:val="single" w:sz="4" w:space="0" w:color="auto"/>
+              <w:bottom w:val="single" w:sz="4" w:space="0" w:color="auto"/>
+              <w:right w:val="single" w:sz="4" w:space="0" w:color="auto"/>
+            </w:tcBorders>
+            <w:hideMark/>
           </w:tcPr>
           <w:p>
             <w:pPr>
               <w:pStyle w:val="Retraitcorpsdetexte"/>
               <w:ind w:left="0"/>
+              <w:jc w:val="left"/>
             </w:pPr>
+            <w:proofErr w:type="spellStart"/>
             <w:r>
-              <w:t>&lt;vehicule&gt;</w:t>
+              <w:t>Vehicule</w:t>
             </w:r>
+            <w:proofErr w:type="spellEnd"/>
           </w:p>
         </w:tc>
       </w:tr>
       <w:tr>
         <w:trPr>
+          <w:cantSplit/>
           <w:trHeight w:val="260"/>
         </w:trPr>
         <w:tc>
           <w:tcPr>
             <w:tcW w:w="3056" w:type="dxa"/>
+            <w:tcBorders>
+              <w:top w:val="single" w:sz="4" w:space="0" w:color="auto"/>
+              <w:left w:val="single" w:sz="4" w:space="0" w:color="auto"/>
+              <w:bottom w:val="single" w:sz="4" w:space="0" w:color="auto"/>
+              <w:right w:val="single" w:sz="4" w:space="0" w:color="auto"/>
+            </w:tcBorders>
+            <w:hideMark/>
           </w:tcPr>
           <w:p>
             <w:pPr>
               <w:pStyle w:val="Retraitcorpsdetexte"/>
               <w:ind w:left="0"/>
+              <w:jc w:val="left"/>
             </w:pPr>
+            <w:proofErr w:type="spellStart"/>
             <w:r>
-              <w:t>estOccupe</w:t>
+              <w:t>EstOccupee</w:t>
             </w:r>
+            <w:proofErr w:type="spellEnd"/>
           </w:p>
         </w:tc>
         <w:tc>
           <w:tcPr>
             <w:tcW w:w="2878" w:type="dxa"/>
+            <w:tcBorders>
+              <w:top w:val="single" w:sz="4" w:space="0" w:color="auto"/>
+              <w:left w:val="single" w:sz="4" w:space="0" w:color="auto"/>
+              <w:bottom w:val="single" w:sz="4" w:space="0" w:color="auto"/>
+              <w:right w:val="single" w:sz="4" w:space="0" w:color="auto"/>
+            </w:tcBorders>
+            <w:hideMark/>
           </w:tcPr>
           <w:p>
             <w:pPr>
               <w:pStyle w:val="Retraitcorpsdetexte"/>
               <w:ind w:left="0"/>
+              <w:jc w:val="left"/>
             </w:pPr>
+            <w:proofErr w:type="spellStart"/>
+            <w:proofErr w:type="gramStart"/>
             <w:r>
-              <w:t>&lt;bool&gt;</w:t>
+              <w:t>bool</w:t>
             </w:r>
+            <w:proofErr w:type="spellEnd"/>
+            <w:proofErr w:type="gramEnd"/>
           </w:p>
         </w:tc>
       </w:tr>
       <w:tr>
         <w:trPr>
+          <w:cantSplit/>
           <w:trHeight w:val="260"/>
         </w:trPr>
         <w:tc>
           <w:tcPr>
             <w:tcW w:w="3056" w:type="dxa"/>
+            <w:tcBorders>
+              <w:top w:val="single" w:sz="4" w:space="0" w:color="auto"/>
+              <w:left w:val="single" w:sz="4" w:space="0" w:color="auto"/>
+              <w:bottom w:val="single" w:sz="4" w:space="0" w:color="auto"/>
+              <w:right w:val="single" w:sz="4" w:space="0" w:color="auto"/>
+            </w:tcBorders>
+            <w:hideMark/>
           </w:tcPr>
           <w:p>
             <w:pPr>
               <w:pStyle w:val="Retraitcorpsdetexte"/>
               <w:ind w:left="0"/>
+              <w:jc w:val="left"/>
             </w:pPr>
+            <w:proofErr w:type="spellStart"/>
             <w:r>
-              <w:t>numero</w:t>
+              <w:t>Numero</w:t>
             </w:r>
+            <w:proofErr w:type="spellEnd"/>
           </w:p>
         </w:tc>
         <w:tc>
           <w:tcPr>
             <w:tcW w:w="2878" w:type="dxa"/>
+            <w:tcBorders>
+              <w:top w:val="single" w:sz="4" w:space="0" w:color="auto"/>
+              <w:left w:val="single" w:sz="4" w:space="0" w:color="auto"/>
+              <w:bottom w:val="single" w:sz="4" w:space="0" w:color="auto"/>
+              <w:right w:val="single" w:sz="4" w:space="0" w:color="auto"/>
+            </w:tcBorders>
+            <w:hideMark/>
           </w:tcPr>
           <w:p>
             <w:pPr>
               <w:pStyle w:val="Retraitcorpsdetexte"/>
               <w:ind w:left="0"/>
+              <w:jc w:val="left"/>
             </w:pPr>
+            <w:proofErr w:type="spellStart"/>
+            <w:proofErr w:type="gramStart"/>
             <w:r>
-              <w:t>&lt;int&gt;</w:t>
+              <w:t>int</w:t>
             </w:r>
+            <w:proofErr w:type="spellEnd"/>
+            <w:proofErr w:type="gramEnd"/>
           </w:p>
         </w:tc>
       </w:tr>
@@ -4454,6 +4617,7 @@
       <w:pPr>
         <w:pStyle w:val="Retraitcorpsdetexte"/>
         <w:ind w:left="2174"/>
+        <w:jc w:val="left"/>
       </w:pPr>
     </w:p>
     <w:p>
@@ -4461,9 +4625,11 @@
         <w:pStyle w:val="Retraitcorpsdetexte"/>
         <w:numPr>
           <w:ilvl w:val="0"/>
-          <w:numId w:val="48"/>
+          <w:numId w:val="6"/>
         </w:numPr>
-      </w:pPr>
+        <w:jc w:val="left"/>
+      </w:pPr>
+      <w:proofErr w:type="spellStart"/>
       <w:r>
         <w:rPr>
           <w:b/>
@@ -4471,6 +4637,7 @@
         </w:rPr>
         <w:t>Vehicule</w:t>
       </w:r>
+      <w:proofErr w:type="spellEnd"/>
       <w:r>
         <w:t xml:space="preserve"> (plaque) </w:t>
       </w:r>
@@ -4488,16 +4655,25 @@
       </w:tblGrid>
       <w:tr>
         <w:trPr>
+          <w:cantSplit/>
           <w:trHeight w:val="260"/>
         </w:trPr>
         <w:tc>
           <w:tcPr>
             <w:tcW w:w="3056" w:type="dxa"/>
+            <w:tcBorders>
+              <w:top w:val="single" w:sz="4" w:space="0" w:color="auto"/>
+              <w:left w:val="single" w:sz="4" w:space="0" w:color="auto"/>
+              <w:bottom w:val="single" w:sz="4" w:space="0" w:color="auto"/>
+              <w:right w:val="single" w:sz="4" w:space="0" w:color="auto"/>
+            </w:tcBorders>
+            <w:hideMark/>
           </w:tcPr>
           <w:p>
             <w:pPr>
               <w:pStyle w:val="Retraitcorpsdetexte"/>
               <w:ind w:left="0"/>
+              <w:jc w:val="left"/>
               <w:rPr>
                 <w:b/>
                 <w:bCs/>
@@ -4508,18 +4684,26 @@
                 <w:b/>
                 <w:bCs/>
               </w:rPr>
-              <w:t>classe</w:t>
+              <w:t>Attribut</w:t>
             </w:r>
           </w:p>
         </w:tc>
         <w:tc>
           <w:tcPr>
             <w:tcW w:w="2878" w:type="dxa"/>
+            <w:tcBorders>
+              <w:top w:val="single" w:sz="4" w:space="0" w:color="auto"/>
+              <w:left w:val="single" w:sz="4" w:space="0" w:color="auto"/>
+              <w:bottom w:val="single" w:sz="4" w:space="0" w:color="auto"/>
+              <w:right w:val="single" w:sz="4" w:space="0" w:color="auto"/>
+            </w:tcBorders>
+            <w:hideMark/>
           </w:tcPr>
           <w:p>
             <w:pPr>
               <w:pStyle w:val="Retraitcorpsdetexte"/>
               <w:ind w:left="0"/>
+              <w:jc w:val="left"/>
               <w:rPr>
                 <w:b/>
                 <w:bCs/>
@@ -4530,41 +4714,60 @@
                 <w:b/>
                 <w:bCs/>
               </w:rPr>
-              <w:t>attribu</w:t>
+              <w:t>Type</w:t>
             </w:r>
           </w:p>
         </w:tc>
       </w:tr>
       <w:tr>
         <w:trPr>
+          <w:cantSplit/>
           <w:trHeight w:val="260"/>
         </w:trPr>
         <w:tc>
           <w:tcPr>
             <w:tcW w:w="3056" w:type="dxa"/>
+            <w:tcBorders>
+              <w:top w:val="single" w:sz="4" w:space="0" w:color="auto"/>
+              <w:left w:val="single" w:sz="4" w:space="0" w:color="auto"/>
+              <w:bottom w:val="single" w:sz="4" w:space="0" w:color="auto"/>
+              <w:right w:val="single" w:sz="4" w:space="0" w:color="auto"/>
+            </w:tcBorders>
+            <w:hideMark/>
           </w:tcPr>
           <w:p>
             <w:pPr>
               <w:pStyle w:val="Retraitcorpsdetexte"/>
               <w:ind w:left="0"/>
+              <w:jc w:val="left"/>
             </w:pPr>
             <w:r>
-              <w:t>plaque</w:t>
+              <w:t>Plaque</w:t>
             </w:r>
           </w:p>
         </w:tc>
         <w:tc>
           <w:tcPr>
             <w:tcW w:w="2878" w:type="dxa"/>
+            <w:tcBorders>
+              <w:top w:val="single" w:sz="4" w:space="0" w:color="auto"/>
+              <w:left w:val="single" w:sz="4" w:space="0" w:color="auto"/>
+              <w:bottom w:val="single" w:sz="4" w:space="0" w:color="auto"/>
+              <w:right w:val="single" w:sz="4" w:space="0" w:color="auto"/>
+            </w:tcBorders>
+            <w:hideMark/>
           </w:tcPr>
           <w:p>
             <w:pPr>
               <w:pStyle w:val="Retraitcorpsdetexte"/>
               <w:ind w:left="0"/>
+              <w:jc w:val="left"/>
             </w:pPr>
+            <w:proofErr w:type="gramStart"/>
             <w:r>
-              <w:t>&lt;string&gt;</w:t>
+              <w:t>string</w:t>
             </w:r>
+            <w:proofErr w:type="gramEnd"/>
           </w:p>
         </w:tc>
       </w:tr>
@@ -4573,6 +4776,7 @@
       <w:pPr>
         <w:pStyle w:val="Retraitcorpsdetexte"/>
         <w:ind w:left="2174"/>
+        <w:jc w:val="left"/>
       </w:pPr>
     </w:p>
     <w:p>
@@ -4580,8 +4784,9 @@
         <w:pStyle w:val="Retraitcorpsdetexte"/>
         <w:numPr>
           <w:ilvl w:val="0"/>
-          <w:numId w:val="48"/>
+          <w:numId w:val="6"/>
         </w:numPr>
+        <w:jc w:val="left"/>
       </w:pPr>
       <w:r>
         <w:rPr>
@@ -4607,16 +4812,25 @@
       </w:tblGrid>
       <w:tr>
         <w:trPr>
+          <w:cantSplit/>
           <w:trHeight w:val="260"/>
         </w:trPr>
         <w:tc>
           <w:tcPr>
             <w:tcW w:w="3056" w:type="dxa"/>
+            <w:tcBorders>
+              <w:top w:val="single" w:sz="4" w:space="0" w:color="auto"/>
+              <w:left w:val="single" w:sz="4" w:space="0" w:color="auto"/>
+              <w:bottom w:val="single" w:sz="4" w:space="0" w:color="auto"/>
+              <w:right w:val="single" w:sz="4" w:space="0" w:color="auto"/>
+            </w:tcBorders>
+            <w:hideMark/>
           </w:tcPr>
           <w:p>
             <w:pPr>
               <w:pStyle w:val="Retraitcorpsdetexte"/>
               <w:ind w:left="0"/>
+              <w:jc w:val="left"/>
               <w:rPr>
                 <w:b/>
                 <w:bCs/>
@@ -4627,18 +4841,26 @@
                 <w:b/>
                 <w:bCs/>
               </w:rPr>
-              <w:t>classe</w:t>
+              <w:t>Attribut</w:t>
             </w:r>
           </w:p>
         </w:tc>
         <w:tc>
           <w:tcPr>
             <w:tcW w:w="2878" w:type="dxa"/>
+            <w:tcBorders>
+              <w:top w:val="single" w:sz="4" w:space="0" w:color="auto"/>
+              <w:left w:val="single" w:sz="4" w:space="0" w:color="auto"/>
+              <w:bottom w:val="single" w:sz="4" w:space="0" w:color="auto"/>
+              <w:right w:val="single" w:sz="4" w:space="0" w:color="auto"/>
+            </w:tcBorders>
+            <w:hideMark/>
           </w:tcPr>
           <w:p>
             <w:pPr>
               <w:pStyle w:val="Retraitcorpsdetexte"/>
               <w:ind w:left="0"/>
+              <w:jc w:val="left"/>
               <w:rPr>
                 <w:b/>
                 <w:bCs/>
@@ -4649,147 +4871,234 @@
                 <w:b/>
                 <w:bCs/>
               </w:rPr>
-              <w:t>attribu</w:t>
+              <w:t>Type</w:t>
             </w:r>
           </w:p>
         </w:tc>
       </w:tr>
       <w:tr>
         <w:trPr>
+          <w:cantSplit/>
           <w:trHeight w:val="260"/>
         </w:trPr>
         <w:tc>
           <w:tcPr>
             <w:tcW w:w="3056" w:type="dxa"/>
+            <w:tcBorders>
+              <w:top w:val="single" w:sz="4" w:space="0" w:color="auto"/>
+              <w:left w:val="single" w:sz="4" w:space="0" w:color="auto"/>
+              <w:bottom w:val="single" w:sz="4" w:space="0" w:color="auto"/>
+              <w:right w:val="single" w:sz="4" w:space="0" w:color="auto"/>
+            </w:tcBorders>
+            <w:hideMark/>
           </w:tcPr>
           <w:p>
             <w:pPr>
               <w:pStyle w:val="Retraitcorpsdetexte"/>
               <w:ind w:left="0"/>
+              <w:jc w:val="left"/>
               <w:rPr>
                 <w:b/>
                 <w:bCs/>
               </w:rPr>
             </w:pPr>
             <w:r>
-              <w:t>NumeroPlace</w:t>
+              <w:t>Place</w:t>
             </w:r>
           </w:p>
         </w:tc>
         <w:tc>
           <w:tcPr>
             <w:tcW w:w="2878" w:type="dxa"/>
+            <w:tcBorders>
+              <w:top w:val="single" w:sz="4" w:space="0" w:color="auto"/>
+              <w:left w:val="single" w:sz="4" w:space="0" w:color="auto"/>
+              <w:bottom w:val="single" w:sz="4" w:space="0" w:color="auto"/>
+              <w:right w:val="single" w:sz="4" w:space="0" w:color="auto"/>
+            </w:tcBorders>
+            <w:hideMark/>
           </w:tcPr>
           <w:p>
             <w:pPr>
               <w:pStyle w:val="Retraitcorpsdetexte"/>
               <w:ind w:left="0"/>
+              <w:jc w:val="left"/>
               <w:rPr>
                 <w:b/>
                 <w:bCs/>
               </w:rPr>
             </w:pPr>
+            <w:proofErr w:type="spellStart"/>
+            <w:proofErr w:type="gramStart"/>
             <w:r>
-              <w:t>&lt;int&gt;</w:t>
+              <w:t>int</w:t>
             </w:r>
+            <w:proofErr w:type="spellEnd"/>
+            <w:proofErr w:type="gramEnd"/>
           </w:p>
         </w:tc>
       </w:tr>
       <w:tr>
         <w:trPr>
+          <w:cantSplit/>
           <w:trHeight w:val="260"/>
         </w:trPr>
         <w:tc>
           <w:tcPr>
             <w:tcW w:w="3056" w:type="dxa"/>
+            <w:tcBorders>
+              <w:top w:val="single" w:sz="4" w:space="0" w:color="auto"/>
+              <w:left w:val="single" w:sz="4" w:space="0" w:color="auto"/>
+              <w:bottom w:val="single" w:sz="4" w:space="0" w:color="auto"/>
+              <w:right w:val="single" w:sz="4" w:space="0" w:color="auto"/>
+            </w:tcBorders>
+            <w:hideMark/>
           </w:tcPr>
           <w:p>
             <w:pPr>
               <w:pStyle w:val="Retraitcorpsdetexte"/>
               <w:ind w:left="0"/>
+              <w:jc w:val="left"/>
+            </w:pPr>
+            <w:proofErr w:type="spellStart"/>
+            <w:r>
+              <w:t>HeureEntree</w:t>
+            </w:r>
+            <w:proofErr w:type="spellEnd"/>
+          </w:p>
+        </w:tc>
+        <w:tc>
+          <w:tcPr>
+            <w:tcW w:w="2878" w:type="dxa"/>
+            <w:tcBorders>
+              <w:top w:val="single" w:sz="4" w:space="0" w:color="auto"/>
+              <w:left w:val="single" w:sz="4" w:space="0" w:color="auto"/>
+              <w:bottom w:val="single" w:sz="4" w:space="0" w:color="auto"/>
+              <w:right w:val="single" w:sz="4" w:space="0" w:color="auto"/>
+            </w:tcBorders>
+            <w:hideMark/>
+          </w:tcPr>
+          <w:p>
+            <w:pPr>
+              <w:pStyle w:val="Retraitcorpsdetexte"/>
+              <w:ind w:left="0"/>
+              <w:jc w:val="left"/>
+            </w:pPr>
+            <w:proofErr w:type="spellStart"/>
+            <w:r>
+              <w:t>DateTime</w:t>
+            </w:r>
+            <w:proofErr w:type="spellEnd"/>
+          </w:p>
+        </w:tc>
+      </w:tr>
+      <w:tr>
+        <w:trPr>
+          <w:cantSplit/>
+          <w:trHeight w:val="260"/>
+        </w:trPr>
+        <w:tc>
+          <w:tcPr>
+            <w:tcW w:w="3056" w:type="dxa"/>
+            <w:tcBorders>
+              <w:top w:val="single" w:sz="4" w:space="0" w:color="auto"/>
+              <w:left w:val="single" w:sz="4" w:space="0" w:color="auto"/>
+              <w:bottom w:val="single" w:sz="4" w:space="0" w:color="auto"/>
+              <w:right w:val="single" w:sz="4" w:space="0" w:color="auto"/>
+            </w:tcBorders>
+            <w:hideMark/>
+          </w:tcPr>
+          <w:p>
+            <w:pPr>
+              <w:pStyle w:val="Retraitcorpsdetexte"/>
+              <w:ind w:left="0"/>
+              <w:jc w:val="left"/>
             </w:pPr>
             <w:r>
-              <w:t>heureEntre</w:t>
+              <w:t>HeureSortie</w:t>
             </w:r>
           </w:p>
         </w:tc>
         <w:tc>
           <w:tcPr>
             <w:tcW w:w="2878" w:type="dxa"/>
+            <w:tcBorders>
+              <w:top w:val="single" w:sz="4" w:space="0" w:color="auto"/>
+              <w:left w:val="single" w:sz="4" w:space="0" w:color="auto"/>
+              <w:bottom w:val="single" w:sz="4" w:space="0" w:color="auto"/>
+              <w:right w:val="single" w:sz="4" w:space="0" w:color="auto"/>
+            </w:tcBorders>
+            <w:hideMark/>
           </w:tcPr>
           <w:p>
             <w:pPr>
               <w:pStyle w:val="Retraitcorpsdetexte"/>
               <w:ind w:left="0"/>
+              <w:jc w:val="left"/>
             </w:pPr>
+            <w:proofErr w:type="spellStart"/>
             <w:r>
-              <w:t>&lt;time&gt;</w:t>
+              <w:t>DateTime</w:t>
             </w:r>
+            <w:proofErr w:type="spellEnd"/>
           </w:p>
         </w:tc>
       </w:tr>
       <w:tr>
         <w:trPr>
+          <w:cantSplit/>
           <w:trHeight w:val="260"/>
         </w:trPr>
         <w:tc>
           <w:tcPr>
             <w:tcW w:w="3056" w:type="dxa"/>
+            <w:tcBorders>
+              <w:top w:val="single" w:sz="4" w:space="0" w:color="auto"/>
+              <w:left w:val="single" w:sz="4" w:space="0" w:color="auto"/>
+              <w:bottom w:val="single" w:sz="4" w:space="0" w:color="auto"/>
+              <w:right w:val="single" w:sz="4" w:space="0" w:color="auto"/>
+            </w:tcBorders>
+            <w:hideMark/>
           </w:tcPr>
           <w:p>
             <w:pPr>
               <w:pStyle w:val="Retraitcorpsdetexte"/>
               <w:ind w:left="0"/>
+              <w:jc w:val="left"/>
             </w:pPr>
+            <w:proofErr w:type="spellStart"/>
             <w:r>
-              <w:t>heureSortie</w:t>
+              <w:t>TarifHoraire</w:t>
             </w:r>
+            <w:proofErr w:type="spellEnd"/>
           </w:p>
         </w:tc>
         <w:tc>
           <w:tcPr>
             <w:tcW w:w="2878" w:type="dxa"/>
+            <w:tcBorders>
+              <w:top w:val="single" w:sz="4" w:space="0" w:color="auto"/>
+              <w:left w:val="single" w:sz="4" w:space="0" w:color="auto"/>
+              <w:bottom w:val="single" w:sz="4" w:space="0" w:color="auto"/>
+              <w:right w:val="single" w:sz="4" w:space="0" w:color="auto"/>
+            </w:tcBorders>
+            <w:hideMark/>
           </w:tcPr>
           <w:p>
             <w:pPr>
               <w:pStyle w:val="Retraitcorpsdetexte"/>
               <w:ind w:left="0"/>
+              <w:jc w:val="left"/>
             </w:pPr>
+            <w:proofErr w:type="spellStart"/>
+            <w:proofErr w:type="gramStart"/>
             <w:r>
-              <w:t>&lt;time&gt;</w:t>
+              <w:t>decimal</w:t>
             </w:r>
-          </w:p>
-        </w:tc>
-      </w:tr>
-      <w:tr>
-        <w:trPr>
-          <w:trHeight w:val="260"/>
-        </w:trPr>
-        <w:tc>
-          <w:tcPr>
-            <w:tcW w:w="3056" w:type="dxa"/>
-          </w:tcPr>
-          <w:p>
-            <w:pPr>
-              <w:pStyle w:val="Retraitcorpsdetexte"/>
-              <w:ind w:left="0"/>
-            </w:pPr>
+            <w:proofErr w:type="spellEnd"/>
+            <w:proofErr w:type="gramEnd"/>
             <w:r>
-              <w:t>tarifHorraire</w:t>
-            </w:r>
-          </w:p>
-        </w:tc>
-        <w:tc>
-          <w:tcPr>
-            <w:tcW w:w="2878" w:type="dxa"/>
-          </w:tcPr>
-          <w:p>
-            <w:pPr>
-              <w:pStyle w:val="Retraitcorpsdetexte"/>
-              <w:ind w:left="0"/>
-            </w:pPr>
-            <w:r>
-              <w:t>&lt;int&gt;</w:t>
+              <w:t xml:space="preserve"> (3 CHF)</w:t>
             </w:r>
           </w:p>
         </w:tc>
@@ -4797,19 +5106,20 @@
     </w:tbl>
     <w:p>
       <w:pPr>
-        <w:pStyle w:val="Corpsdetexte"/>
-      </w:pPr>
-      <w:r>
-        <w:t>Le montant total payé n'est pas stocké comme attribut : il est recalculé à la demande par la classe Parking, en additionnant le montant de chaque transaction de type SORTIE enregistrée dans l'historique. Cette valeur s'affiche dans la fonctionnalité « Statistiques du jour ».</w:t>
-      </w:r>
-    </w:p>
-    <w:p>
-      <w:pPr>
         <w:pStyle w:val="Retraitcorpsdetexte"/>
         <w:numPr>
           <w:ilvl w:val="0"/>
-          <w:numId w:val="48"/>
+          <w:numId w:val="6"/>
         </w:numPr>
+      </w:pPr>
+      <w:r>
+        <w:t>Le montant total payé est calculé par Ticket, en additionnant les montants des tickets terminés. Parking affiche ensuite ce total dans les statistiques.</w:t>
+      </w:r>
+    </w:p>
+    <w:p>
+      <w:pPr>
+        <w:pStyle w:val="Retraitcorpsdetexte"/>
+        <w:ind w:left="2174"/>
       </w:pPr>
     </w:p>
     <w:p>
@@ -4947,7 +5257,7 @@
         <w:pStyle w:val="Retraitcorpsdetexte"/>
         <w:numPr>
           <w:ilvl w:val="0"/>
-          <w:numId w:val="50"/>
+          <w:numId w:val="8"/>
         </w:numPr>
         <w:ind w:left="1134"/>
         <w:rPr>
@@ -4966,7 +5276,7 @@
         <w:pStyle w:val="Retraitcorpsdetexte"/>
         <w:numPr>
           <w:ilvl w:val="0"/>
-          <w:numId w:val="50"/>
+          <w:numId w:val="8"/>
         </w:numPr>
         <w:ind w:left="1134"/>
         <w:rPr>
@@ -4985,7 +5295,7 @@
         <w:pStyle w:val="Retraitcorpsdetexte"/>
         <w:numPr>
           <w:ilvl w:val="0"/>
-          <w:numId w:val="50"/>
+          <w:numId w:val="8"/>
         </w:numPr>
         <w:ind w:left="1134"/>
         <w:rPr>
@@ -5004,7 +5314,7 @@
         <w:pStyle w:val="Retraitcorpsdetexte"/>
         <w:numPr>
           <w:ilvl w:val="0"/>
-          <w:numId w:val="50"/>
+          <w:numId w:val="8"/>
         </w:numPr>
         <w:ind w:left="1134"/>
         <w:rPr>
@@ -5051,7 +5361,7 @@
         <w:pStyle w:val="Retraitcorpsdetexte"/>
         <w:numPr>
           <w:ilvl w:val="0"/>
-          <w:numId w:val="50"/>
+          <w:numId w:val="8"/>
         </w:numPr>
         <w:ind w:left="1134"/>
         <w:rPr>
@@ -5070,7 +5380,31 @@
           <w:bCs/>
           <w:lang w:val="fr-FR"/>
         </w:rPr>
-        <w:t>1 euro par minute</w:t>
+        <w:t>3</w:t>
+      </w:r>
+      <w:r>
+        <w:rPr>
+          <w:b/>
+          <w:bCs/>
+          <w:lang w:val="fr-FR"/>
+        </w:rPr>
+        <w:t xml:space="preserve"> </w:t>
+      </w:r>
+      <w:r>
+        <w:rPr>
+          <w:b/>
+          <w:bCs/>
+          <w:lang w:val="fr-FR"/>
+        </w:rPr>
+        <w:t>CHF</w:t>
+      </w:r>
+      <w:r>
+        <w:rPr>
+          <w:b/>
+          <w:bCs/>
+          <w:lang w:val="fr-FR"/>
+        </w:rPr>
+        <w:t xml:space="preserve"> par minute</w:t>
       </w:r>
       <w:r>
         <w:rPr>
@@ -5084,7 +5418,7 @@
         <w:pStyle w:val="Retraitcorpsdetexte"/>
         <w:numPr>
           <w:ilvl w:val="0"/>
-          <w:numId w:val="50"/>
+          <w:numId w:val="8"/>
         </w:numPr>
         <w:ind w:left="1134"/>
         <w:rPr>
@@ -5592,6 +5926,9 @@
       <w:pPr>
         <w:pStyle w:val="Retraitcorpsdetexte"/>
       </w:pPr>
+      <w:r>
+        <w:t>Résultats obtenus : 24 tests réussis, aucun échec. Les cas testés incluent les plaques invalides ou en double, le parking complet, les recherches par plaque et par place, les sorties confirmées ou annulées, les paiements et le menu. Les tests utilisent les classes du programme. La compilation n’a produit ni erreur ni avertissement.</w:t>
+      </w:r>
     </w:p>
     <w:p>
       <w:pPr>
@@ -5818,7 +6155,7 @@
         <w:pStyle w:val="Retraitcorpsdetexte3"/>
         <w:numPr>
           <w:ilvl w:val="0"/>
-          <w:numId w:val="49"/>
+          <w:numId w:val="7"/>
         </w:numPr>
         <w:rPr>
           <w:rFonts w:asciiTheme="majorHAnsi" w:hAnsiTheme="majorHAnsi"/>
@@ -5840,7 +6177,7 @@
         <w:pStyle w:val="Retraitcorpsdetexte3"/>
         <w:numPr>
           <w:ilvl w:val="0"/>
-          <w:numId w:val="49"/>
+          <w:numId w:val="7"/>
         </w:numPr>
         <w:rPr>
           <w:rFonts w:asciiTheme="majorHAnsi" w:hAnsiTheme="majorHAnsi"/>
@@ -5880,7 +6217,7 @@
         <w:pStyle w:val="Retraitcorpsdetexte3"/>
         <w:numPr>
           <w:ilvl w:val="0"/>
-          <w:numId w:val="49"/>
+          <w:numId w:val="7"/>
         </w:numPr>
         <w:rPr>
           <w:rFonts w:asciiTheme="majorHAnsi" w:hAnsiTheme="majorHAnsi"/>
@@ -5902,7 +6239,7 @@
         <w:pStyle w:val="Retraitcorpsdetexte3"/>
         <w:numPr>
           <w:ilvl w:val="0"/>
-          <w:numId w:val="49"/>
+          <w:numId w:val="7"/>
         </w:numPr>
         <w:rPr>
           <w:rFonts w:asciiTheme="majorHAnsi" w:hAnsiTheme="majorHAnsi"/>
@@ -5942,7 +6279,7 @@
         <w:pStyle w:val="Retraitcorpsdetexte3"/>
         <w:numPr>
           <w:ilvl w:val="0"/>
-          <w:numId w:val="49"/>
+          <w:numId w:val="7"/>
         </w:numPr>
         <w:rPr>
           <w:rFonts w:asciiTheme="majorHAnsi" w:hAnsiTheme="majorHAnsi"/>
@@ -5964,7 +6301,7 @@
         <w:pStyle w:val="Retraitcorpsdetexte3"/>
         <w:numPr>
           <w:ilvl w:val="0"/>
-          <w:numId w:val="49"/>
+          <w:numId w:val="7"/>
         </w:numPr>
         <w:rPr>
           <w:rFonts w:asciiTheme="majorHAnsi" w:hAnsiTheme="majorHAnsi"/>
@@ -6172,7 +6509,7 @@
         <w:pStyle w:val="Retraitcorpsdetexte3"/>
         <w:numPr>
           <w:ilvl w:val="0"/>
-          <w:numId w:val="48"/>
+          <w:numId w:val="6"/>
         </w:numPr>
         <w:rPr>
           <w:b/>
@@ -6233,7 +6570,7 @@
         <w:pStyle w:val="Retraitcorpsdetexte3"/>
         <w:numPr>
           <w:ilvl w:val="0"/>
-          <w:numId w:val="48"/>
+          <w:numId w:val="6"/>
         </w:numPr>
         <w:rPr>
           <w:sz w:val="28"/>
@@ -6300,7 +6637,7 @@
         <w:pStyle w:val="Retraitcorpsdetexte3"/>
         <w:numPr>
           <w:ilvl w:val="0"/>
-          <w:numId w:val="48"/>
+          <w:numId w:val="6"/>
         </w:numPr>
         <w:rPr>
           <w:sz w:val="28"/>
@@ -6343,7 +6680,7 @@
         <w:pStyle w:val="Retraitcorpsdetexte3"/>
         <w:numPr>
           <w:ilvl w:val="0"/>
-          <w:numId w:val="48"/>
+          <w:numId w:val="6"/>
         </w:numPr>
         <w:rPr>
           <w:b/>
@@ -6396,7 +6733,7 @@
         <w:pStyle w:val="Retraitcorpsdetexte3"/>
         <w:numPr>
           <w:ilvl w:val="0"/>
-          <w:numId w:val="48"/>
+          <w:numId w:val="6"/>
         </w:numPr>
         <w:rPr>
           <w:b/>
@@ -6441,7 +6778,7 @@
         <w:pStyle w:val="Retraitcorpsdetexte3"/>
         <w:numPr>
           <w:ilvl w:val="0"/>
-          <w:numId w:val="48"/>
+          <w:numId w:val="6"/>
         </w:numPr>
         <w:rPr>
           <w:b/>
@@ -7044,7 +7381,7 @@
               <w:noProof/>
               <w:szCs w:val="16"/>
             </w:rPr>
-            <w:t>11.09.2026 08:26</w:t>
+            <w:t>25.10.2026 17:10</w:t>
           </w:r>
           <w:r>
             <w:rPr>
@@ -7131,9 +7468,9 @@
       <w:tblLook w:val="01E0" w:firstRow="1" w:lastRow="1" w:firstColumn="1" w:lastColumn="1" w:noHBand="0" w:noVBand="0"/>
     </w:tblPr>
     <w:tblGrid>
-      <w:gridCol w:w="2390"/>
-      <w:gridCol w:w="4411"/>
-      <w:gridCol w:w="2269"/>
+      <w:gridCol w:w="2402"/>
+      <w:gridCol w:w="4400"/>
+      <w:gridCol w:w="2268"/>
     </w:tblGrid>
     <w:tr>
       <w:trPr>
@@ -7256,310 +7593,12 @@
         <v:path o:extrusionok="f" gradientshapeok="t" o:connecttype="rect"/>
         <o:lock v:ext="edit" aspectratio="t"/>
       </v:shapetype>
-      <v:shape id="_x0000_i1025" type="#_x0000_t75" style="width:11.4pt;height:11.4pt" o:bullet="t">
+      <v:shape id="_x0000_i1025" type="#_x0000_t75" style="width:11.25pt;height:11.25pt" o:bullet="t">
         <v:imagedata r:id="rId1" o:title="BD10263_"/>
       </v:shape>
     </w:pict>
   </w:numPicBullet>
   <w:abstractNum w:abstractNumId="0" w15:restartNumberingAfterBreak="0">
-    <w:nsid w:val="FFFFFF7C"/>
-    <w:multiLevelType w:val="singleLevel"/>
-    <w:tmpl w:val="4328A0CE"/>
-    <w:lvl w:ilvl="0">
-      <w:start w:val="1"/>
-      <w:numFmt w:val="decimal"/>
-      <w:lvlText w:val="%1."/>
-      <w:lvlJc w:val="left"/>
-      <w:pPr>
-        <w:tabs>
-          <w:tab w:val="num" w:pos="1492"/>
-        </w:tabs>
-        <w:ind w:left="1492" w:hanging="360"/>
-      </w:pPr>
-    </w:lvl>
-  </w:abstractNum>
-  <w:abstractNum w:abstractNumId="1" w15:restartNumberingAfterBreak="0">
-    <w:nsid w:val="FFFFFF7D"/>
-    <w:multiLevelType w:val="singleLevel"/>
-    <w:tmpl w:val="D812EAFE"/>
-    <w:lvl w:ilvl="0">
-      <w:start w:val="1"/>
-      <w:numFmt w:val="decimal"/>
-      <w:lvlText w:val="%1."/>
-      <w:lvlJc w:val="left"/>
-      <w:pPr>
-        <w:tabs>
-          <w:tab w:val="num" w:pos="1209"/>
-        </w:tabs>
-        <w:ind w:left="1209" w:hanging="360"/>
-      </w:pPr>
-    </w:lvl>
-  </w:abstractNum>
-  <w:abstractNum w:abstractNumId="2" w15:restartNumberingAfterBreak="0">
-    <w:nsid w:val="FFFFFF7E"/>
-    <w:multiLevelType w:val="singleLevel"/>
-    <w:tmpl w:val="759C624C"/>
-    <w:lvl w:ilvl="0">
-      <w:start w:val="1"/>
-      <w:numFmt w:val="decimal"/>
-      <w:lvlText w:val="%1."/>
-      <w:lvlJc w:val="left"/>
-      <w:pPr>
-        <w:tabs>
-          <w:tab w:val="num" w:pos="926"/>
-        </w:tabs>
-        <w:ind w:left="926" w:hanging="360"/>
-      </w:pPr>
-    </w:lvl>
-  </w:abstractNum>
-  <w:abstractNum w:abstractNumId="3" w15:restartNumberingAfterBreak="0">
-    <w:nsid w:val="FFFFFF7F"/>
-    <w:multiLevelType w:val="singleLevel"/>
-    <w:tmpl w:val="22B62718"/>
-    <w:lvl w:ilvl="0">
-      <w:start w:val="1"/>
-      <w:numFmt w:val="decimal"/>
-      <w:lvlText w:val="%1."/>
-      <w:lvlJc w:val="left"/>
-      <w:pPr>
-        <w:tabs>
-          <w:tab w:val="num" w:pos="643"/>
-        </w:tabs>
-        <w:ind w:left="643" w:hanging="360"/>
-      </w:pPr>
-    </w:lvl>
-  </w:abstractNum>
-  <w:abstractNum w:abstractNumId="4" w15:restartNumberingAfterBreak="0">
-    <w:nsid w:val="FFFFFF80"/>
-    <w:multiLevelType w:val="singleLevel"/>
-    <w:tmpl w:val="466E7814"/>
-    <w:lvl w:ilvl="0">
-      <w:start w:val="1"/>
-      <w:numFmt w:val="bullet"/>
-      <w:lvlText w:val=""/>
-      <w:lvlJc w:val="left"/>
-      <w:pPr>
-        <w:tabs>
-          <w:tab w:val="num" w:pos="1492"/>
-        </w:tabs>
-        <w:ind w:left="1492" w:hanging="360"/>
-      </w:pPr>
-      <w:rPr>
-        <w:rFonts w:ascii="Symbol" w:hAnsi="Symbol" w:hint="default"/>
-      </w:rPr>
-    </w:lvl>
-  </w:abstractNum>
-  <w:abstractNum w:abstractNumId="5" w15:restartNumberingAfterBreak="0">
-    <w:nsid w:val="FFFFFF81"/>
-    <w:multiLevelType w:val="singleLevel"/>
-    <w:tmpl w:val="CD84B6E8"/>
-    <w:lvl w:ilvl="0">
-      <w:start w:val="1"/>
-      <w:numFmt w:val="bullet"/>
-      <w:lvlText w:val=""/>
-      <w:lvlJc w:val="left"/>
-      <w:pPr>
-        <w:tabs>
-          <w:tab w:val="num" w:pos="1209"/>
-        </w:tabs>
-        <w:ind w:left="1209" w:hanging="360"/>
-      </w:pPr>
-      <w:rPr>
-        <w:rFonts w:ascii="Symbol" w:hAnsi="Symbol" w:hint="default"/>
-      </w:rPr>
-    </w:lvl>
-  </w:abstractNum>
-  <w:abstractNum w:abstractNumId="6" w15:restartNumberingAfterBreak="0">
-    <w:nsid w:val="FFFFFF82"/>
-    <w:multiLevelType w:val="singleLevel"/>
-    <w:tmpl w:val="EA4290CC"/>
-    <w:lvl w:ilvl="0">
-      <w:start w:val="1"/>
-      <w:numFmt w:val="bullet"/>
-      <w:lvlText w:val=""/>
-      <w:lvlJc w:val="left"/>
-      <w:pPr>
-        <w:tabs>
-          <w:tab w:val="num" w:pos="926"/>
-        </w:tabs>
-        <w:ind w:left="926" w:hanging="360"/>
-      </w:pPr>
-      <w:rPr>
-        <w:rFonts w:ascii="Symbol" w:hAnsi="Symbol" w:hint="default"/>
-      </w:rPr>
-    </w:lvl>
-  </w:abstractNum>
-  <w:abstractNum w:abstractNumId="7" w15:restartNumberingAfterBreak="0">
-    <w:nsid w:val="FFFFFF83"/>
-    <w:multiLevelType w:val="singleLevel"/>
-    <w:tmpl w:val="B164EE08"/>
-    <w:lvl w:ilvl="0">
-      <w:start w:val="1"/>
-      <w:numFmt w:val="bullet"/>
-      <w:lvlText w:val=""/>
-      <w:lvlJc w:val="left"/>
-      <w:pPr>
-        <w:tabs>
-          <w:tab w:val="num" w:pos="643"/>
-        </w:tabs>
-        <w:ind w:left="643" w:hanging="360"/>
-      </w:pPr>
-      <w:rPr>
-        <w:rFonts w:ascii="Symbol" w:hAnsi="Symbol" w:hint="default"/>
-      </w:rPr>
-    </w:lvl>
-  </w:abstractNum>
-  <w:abstractNum w:abstractNumId="8" w15:restartNumberingAfterBreak="0">
-    <w:nsid w:val="FFFFFF88"/>
-    <w:multiLevelType w:val="singleLevel"/>
-    <w:tmpl w:val="0B4A9174"/>
-    <w:lvl w:ilvl="0">
-      <w:start w:val="1"/>
-      <w:numFmt w:val="decimal"/>
-      <w:lvlText w:val="%1."/>
-      <w:lvlJc w:val="left"/>
-      <w:pPr>
-        <w:tabs>
-          <w:tab w:val="num" w:pos="360"/>
-        </w:tabs>
-        <w:ind w:left="360" w:hanging="360"/>
-      </w:pPr>
-    </w:lvl>
-  </w:abstractNum>
-  <w:abstractNum w:abstractNumId="9" w15:restartNumberingAfterBreak="0">
-    <w:nsid w:val="FFFFFF89"/>
-    <w:multiLevelType w:val="singleLevel"/>
-    <w:tmpl w:val="2FD089B0"/>
-    <w:lvl w:ilvl="0">
-      <w:start w:val="1"/>
-      <w:numFmt w:val="bullet"/>
-      <w:lvlText w:val=""/>
-      <w:lvlJc w:val="left"/>
-      <w:pPr>
-        <w:tabs>
-          <w:tab w:val="num" w:pos="360"/>
-        </w:tabs>
-        <w:ind w:left="360" w:hanging="360"/>
-      </w:pPr>
-      <w:rPr>
-        <w:rFonts w:ascii="Symbol" w:hAnsi="Symbol" w:hint="default"/>
-      </w:rPr>
-    </w:lvl>
-  </w:abstractNum>
-  <w:abstractNum w:abstractNumId="10" w15:restartNumberingAfterBreak="0">
-    <w:nsid w:val="00045A22"/>
-    <w:multiLevelType w:val="multilevel"/>
-    <w:tmpl w:val="100C0021"/>
-    <w:lvl w:ilvl="0">
-      <w:start w:val="1"/>
-      <w:numFmt w:val="bullet"/>
-      <w:lvlText w:val=""/>
-      <w:lvlJc w:val="left"/>
-      <w:pPr>
-        <w:ind w:left="360" w:hanging="360"/>
-      </w:pPr>
-      <w:rPr>
-        <w:rFonts w:ascii="Wingdings" w:hAnsi="Wingdings" w:hint="default"/>
-      </w:rPr>
-    </w:lvl>
-    <w:lvl w:ilvl="1">
-      <w:start w:val="1"/>
-      <w:numFmt w:val="bullet"/>
-      <w:lvlText w:val=""/>
-      <w:lvlJc w:val="left"/>
-      <w:pPr>
-        <w:ind w:left="720" w:hanging="360"/>
-      </w:pPr>
-      <w:rPr>
-        <w:rFonts w:ascii="Wingdings" w:hAnsi="Wingdings" w:hint="default"/>
-      </w:rPr>
-    </w:lvl>
-    <w:lvl w:ilvl="2">
-      <w:start w:val="1"/>
-      <w:numFmt w:val="bullet"/>
-      <w:lvlText w:val=""/>
-      <w:lvlJc w:val="left"/>
-      <w:pPr>
-        <w:ind w:left="1080" w:hanging="360"/>
-      </w:pPr>
-      <w:rPr>
-        <w:rFonts w:ascii="Wingdings" w:hAnsi="Wingdings" w:hint="default"/>
-      </w:rPr>
-    </w:lvl>
-    <w:lvl w:ilvl="3">
-      <w:start w:val="1"/>
-      <w:numFmt w:val="bullet"/>
-      <w:lvlText w:val=""/>
-      <w:lvlJc w:val="left"/>
-      <w:pPr>
-        <w:ind w:left="1440" w:hanging="360"/>
-      </w:pPr>
-      <w:rPr>
-        <w:rFonts w:ascii="Symbol" w:hAnsi="Symbol" w:hint="default"/>
-      </w:rPr>
-    </w:lvl>
-    <w:lvl w:ilvl="4">
-      <w:start w:val="1"/>
-      <w:numFmt w:val="bullet"/>
-      <w:lvlText w:val=""/>
-      <w:lvlJc w:val="left"/>
-      <w:pPr>
-        <w:ind w:left="1800" w:hanging="360"/>
-      </w:pPr>
-      <w:rPr>
-        <w:rFonts w:ascii="Symbol" w:hAnsi="Symbol" w:hint="default"/>
-      </w:rPr>
-    </w:lvl>
-    <w:lvl w:ilvl="5">
-      <w:start w:val="1"/>
-      <w:numFmt w:val="bullet"/>
-      <w:lvlText w:val=""/>
-      <w:lvlJc w:val="left"/>
-      <w:pPr>
-        <w:ind w:left="2160" w:hanging="360"/>
-      </w:pPr>
-      <w:rPr>
-        <w:rFonts w:ascii="Wingdings" w:hAnsi="Wingdings" w:hint="default"/>
-      </w:rPr>
-    </w:lvl>
-    <w:lvl w:ilvl="6">
-      <w:start w:val="1"/>
-      <w:numFmt w:val="bullet"/>
-      <w:lvlText w:val=""/>
-      <w:lvlJc w:val="left"/>
-      <w:pPr>
-        <w:ind w:left="2520" w:hanging="360"/>
-      </w:pPr>
-      <w:rPr>
-        <w:rFonts w:ascii="Wingdings" w:hAnsi="Wingdings" w:hint="default"/>
-      </w:rPr>
-    </w:lvl>
-    <w:lvl w:ilvl="7">
-      <w:start w:val="1"/>
-      <w:numFmt w:val="bullet"/>
-      <w:lvlText w:val=""/>
-      <w:lvlJc w:val="left"/>
-      <w:pPr>
-        <w:ind w:left="2880" w:hanging="360"/>
-      </w:pPr>
-      <w:rPr>
-        <w:rFonts w:ascii="Symbol" w:hAnsi="Symbol" w:hint="default"/>
-      </w:rPr>
-    </w:lvl>
-    <w:lvl w:ilvl="8">
-      <w:start w:val="1"/>
-      <w:numFmt w:val="bullet"/>
-      <w:lvlText w:val=""/>
-      <w:lvlJc w:val="left"/>
-      <w:pPr>
-        <w:ind w:left="3240" w:hanging="360"/>
-      </w:pPr>
-      <w:rPr>
-        <w:rFonts w:ascii="Symbol" w:hAnsi="Symbol" w:hint="default"/>
-      </w:rPr>
-    </w:lvl>
-  </w:abstractNum>
-  <w:abstractNum w:abstractNumId="11" w15:restartNumberingAfterBreak="0">
     <w:nsid w:val="02202AAE"/>
     <w:multiLevelType w:val="multilevel"/>
     <w:tmpl w:val="C2ACEA3A"/>
@@ -7704,346 +7743,7 @@
       </w:rPr>
     </w:lvl>
   </w:abstractNum>
-  <w:abstractNum w:abstractNumId="12" w15:restartNumberingAfterBreak="0">
-    <w:nsid w:val="037669EE"/>
-    <w:multiLevelType w:val="multilevel"/>
-    <w:tmpl w:val="100C0021"/>
-    <w:lvl w:ilvl="0">
-      <w:start w:val="1"/>
-      <w:numFmt w:val="bullet"/>
-      <w:lvlText w:val=""/>
-      <w:lvlJc w:val="left"/>
-      <w:pPr>
-        <w:ind w:left="360" w:hanging="360"/>
-      </w:pPr>
-      <w:rPr>
-        <w:rFonts w:ascii="Wingdings" w:hAnsi="Wingdings" w:hint="default"/>
-      </w:rPr>
-    </w:lvl>
-    <w:lvl w:ilvl="1">
-      <w:start w:val="1"/>
-      <w:numFmt w:val="bullet"/>
-      <w:lvlText w:val=""/>
-      <w:lvlJc w:val="left"/>
-      <w:pPr>
-        <w:ind w:left="720" w:hanging="360"/>
-      </w:pPr>
-      <w:rPr>
-        <w:rFonts w:ascii="Wingdings" w:hAnsi="Wingdings" w:hint="default"/>
-      </w:rPr>
-    </w:lvl>
-    <w:lvl w:ilvl="2">
-      <w:start w:val="1"/>
-      <w:numFmt w:val="bullet"/>
-      <w:lvlText w:val=""/>
-      <w:lvlJc w:val="left"/>
-      <w:pPr>
-        <w:ind w:left="1080" w:hanging="360"/>
-      </w:pPr>
-      <w:rPr>
-        <w:rFonts w:ascii="Wingdings" w:hAnsi="Wingdings" w:hint="default"/>
-      </w:rPr>
-    </w:lvl>
-    <w:lvl w:ilvl="3">
-      <w:start w:val="1"/>
-      <w:numFmt w:val="bullet"/>
-      <w:lvlText w:val=""/>
-      <w:lvlJc w:val="left"/>
-      <w:pPr>
-        <w:ind w:left="1440" w:hanging="360"/>
-      </w:pPr>
-      <w:rPr>
-        <w:rFonts w:ascii="Symbol" w:hAnsi="Symbol" w:hint="default"/>
-      </w:rPr>
-    </w:lvl>
-    <w:lvl w:ilvl="4">
-      <w:start w:val="1"/>
-      <w:numFmt w:val="bullet"/>
-      <w:lvlText w:val=""/>
-      <w:lvlJc w:val="left"/>
-      <w:pPr>
-        <w:ind w:left="1800" w:hanging="360"/>
-      </w:pPr>
-      <w:rPr>
-        <w:rFonts w:ascii="Symbol" w:hAnsi="Symbol" w:hint="default"/>
-      </w:rPr>
-    </w:lvl>
-    <w:lvl w:ilvl="5">
-      <w:start w:val="1"/>
-      <w:numFmt w:val="bullet"/>
-      <w:lvlText w:val=""/>
-      <w:lvlJc w:val="left"/>
-      <w:pPr>
-        <w:ind w:left="2160" w:hanging="360"/>
-      </w:pPr>
-      <w:rPr>
-        <w:rFonts w:ascii="Wingdings" w:hAnsi="Wingdings" w:hint="default"/>
-      </w:rPr>
-    </w:lvl>
-    <w:lvl w:ilvl="6">
-      <w:start w:val="1"/>
-      <w:numFmt w:val="bullet"/>
-      <w:lvlText w:val=""/>
-      <w:lvlJc w:val="left"/>
-      <w:pPr>
-        <w:ind w:left="2520" w:hanging="360"/>
-      </w:pPr>
-      <w:rPr>
-        <w:rFonts w:ascii="Wingdings" w:hAnsi="Wingdings" w:hint="default"/>
-      </w:rPr>
-    </w:lvl>
-    <w:lvl w:ilvl="7">
-      <w:start w:val="1"/>
-      <w:numFmt w:val="bullet"/>
-      <w:lvlText w:val=""/>
-      <w:lvlJc w:val="left"/>
-      <w:pPr>
-        <w:ind w:left="2880" w:hanging="360"/>
-      </w:pPr>
-      <w:rPr>
-        <w:rFonts w:ascii="Symbol" w:hAnsi="Symbol" w:hint="default"/>
-      </w:rPr>
-    </w:lvl>
-    <w:lvl w:ilvl="8">
-      <w:start w:val="1"/>
-      <w:numFmt w:val="bullet"/>
-      <w:lvlText w:val=""/>
-      <w:lvlJc w:val="left"/>
-      <w:pPr>
-        <w:ind w:left="3240" w:hanging="360"/>
-      </w:pPr>
-      <w:rPr>
-        <w:rFonts w:ascii="Symbol" w:hAnsi="Symbol" w:hint="default"/>
-      </w:rPr>
-    </w:lvl>
-  </w:abstractNum>
-  <w:abstractNum w:abstractNumId="13" w15:restartNumberingAfterBreak="0">
-    <w:nsid w:val="06482CAE"/>
-    <w:multiLevelType w:val="multilevel"/>
-    <w:tmpl w:val="100C0021"/>
-    <w:lvl w:ilvl="0">
-      <w:start w:val="1"/>
-      <w:numFmt w:val="bullet"/>
-      <w:lvlText w:val=""/>
-      <w:lvlJc w:val="left"/>
-      <w:pPr>
-        <w:ind w:left="360" w:hanging="360"/>
-      </w:pPr>
-      <w:rPr>
-        <w:rFonts w:ascii="Wingdings" w:hAnsi="Wingdings" w:hint="default"/>
-      </w:rPr>
-    </w:lvl>
-    <w:lvl w:ilvl="1">
-      <w:start w:val="1"/>
-      <w:numFmt w:val="bullet"/>
-      <w:lvlText w:val=""/>
-      <w:lvlJc w:val="left"/>
-      <w:pPr>
-        <w:ind w:left="720" w:hanging="360"/>
-      </w:pPr>
-      <w:rPr>
-        <w:rFonts w:ascii="Wingdings" w:hAnsi="Wingdings" w:hint="default"/>
-      </w:rPr>
-    </w:lvl>
-    <w:lvl w:ilvl="2">
-      <w:start w:val="1"/>
-      <w:numFmt w:val="bullet"/>
-      <w:lvlText w:val=""/>
-      <w:lvlJc w:val="left"/>
-      <w:pPr>
-        <w:ind w:left="1080" w:hanging="360"/>
-      </w:pPr>
-      <w:rPr>
-        <w:rFonts w:ascii="Wingdings" w:hAnsi="Wingdings" w:hint="default"/>
-      </w:rPr>
-    </w:lvl>
-    <w:lvl w:ilvl="3">
-      <w:start w:val="1"/>
-      <w:numFmt w:val="bullet"/>
-      <w:lvlText w:val=""/>
-      <w:lvlJc w:val="left"/>
-      <w:pPr>
-        <w:ind w:left="1440" w:hanging="360"/>
-      </w:pPr>
-      <w:rPr>
-        <w:rFonts w:ascii="Symbol" w:hAnsi="Symbol" w:hint="default"/>
-      </w:rPr>
-    </w:lvl>
-    <w:lvl w:ilvl="4">
-      <w:start w:val="1"/>
-      <w:numFmt w:val="bullet"/>
-      <w:lvlText w:val=""/>
-      <w:lvlJc w:val="left"/>
-      <w:pPr>
-        <w:ind w:left="1800" w:hanging="360"/>
-      </w:pPr>
-      <w:rPr>
-        <w:rFonts w:ascii="Symbol" w:hAnsi="Symbol" w:hint="default"/>
-      </w:rPr>
-    </w:lvl>
-    <w:lvl w:ilvl="5">
-      <w:start w:val="1"/>
-      <w:numFmt w:val="bullet"/>
-      <w:lvlText w:val=""/>
-      <w:lvlJc w:val="left"/>
-      <w:pPr>
-        <w:ind w:left="2160" w:hanging="360"/>
-      </w:pPr>
-      <w:rPr>
-        <w:rFonts w:ascii="Wingdings" w:hAnsi="Wingdings" w:hint="default"/>
-      </w:rPr>
-    </w:lvl>
-    <w:lvl w:ilvl="6">
-      <w:start w:val="1"/>
-      <w:numFmt w:val="bullet"/>
-      <w:lvlText w:val=""/>
-      <w:lvlJc w:val="left"/>
-      <w:pPr>
-        <w:ind w:left="2520" w:hanging="360"/>
-      </w:pPr>
-      <w:rPr>
-        <w:rFonts w:ascii="Wingdings" w:hAnsi="Wingdings" w:hint="default"/>
-      </w:rPr>
-    </w:lvl>
-    <w:lvl w:ilvl="7">
-      <w:start w:val="1"/>
-      <w:numFmt w:val="bullet"/>
-      <w:lvlText w:val=""/>
-      <w:lvlJc w:val="left"/>
-      <w:pPr>
-        <w:ind w:left="2880" w:hanging="360"/>
-      </w:pPr>
-      <w:rPr>
-        <w:rFonts w:ascii="Symbol" w:hAnsi="Symbol" w:hint="default"/>
-      </w:rPr>
-    </w:lvl>
-    <w:lvl w:ilvl="8">
-      <w:start w:val="1"/>
-      <w:numFmt w:val="bullet"/>
-      <w:lvlText w:val=""/>
-      <w:lvlJc w:val="left"/>
-      <w:pPr>
-        <w:ind w:left="3240" w:hanging="360"/>
-      </w:pPr>
-      <w:rPr>
-        <w:rFonts w:ascii="Symbol" w:hAnsi="Symbol" w:hint="default"/>
-      </w:rPr>
-    </w:lvl>
-  </w:abstractNum>
-  <w:abstractNum w:abstractNumId="14" w15:restartNumberingAfterBreak="0">
-    <w:nsid w:val="067320D8"/>
-    <w:multiLevelType w:val="multilevel"/>
-    <w:tmpl w:val="100C0021"/>
-    <w:lvl w:ilvl="0">
-      <w:start w:val="1"/>
-      <w:numFmt w:val="bullet"/>
-      <w:lvlText w:val=""/>
-      <w:lvlJc w:val="left"/>
-      <w:pPr>
-        <w:ind w:left="360" w:hanging="360"/>
-      </w:pPr>
-      <w:rPr>
-        <w:rFonts w:ascii="Wingdings" w:hAnsi="Wingdings" w:hint="default"/>
-      </w:rPr>
-    </w:lvl>
-    <w:lvl w:ilvl="1">
-      <w:start w:val="1"/>
-      <w:numFmt w:val="bullet"/>
-      <w:lvlText w:val=""/>
-      <w:lvlJc w:val="left"/>
-      <w:pPr>
-        <w:ind w:left="720" w:hanging="360"/>
-      </w:pPr>
-      <w:rPr>
-        <w:rFonts w:ascii="Wingdings" w:hAnsi="Wingdings" w:hint="default"/>
-      </w:rPr>
-    </w:lvl>
-    <w:lvl w:ilvl="2">
-      <w:start w:val="1"/>
-      <w:numFmt w:val="bullet"/>
-      <w:lvlText w:val=""/>
-      <w:lvlJc w:val="left"/>
-      <w:pPr>
-        <w:ind w:left="1080" w:hanging="360"/>
-      </w:pPr>
-      <w:rPr>
-        <w:rFonts w:ascii="Wingdings" w:hAnsi="Wingdings" w:hint="default"/>
-      </w:rPr>
-    </w:lvl>
-    <w:lvl w:ilvl="3">
-      <w:start w:val="1"/>
-      <w:numFmt w:val="bullet"/>
-      <w:lvlText w:val=""/>
-      <w:lvlJc w:val="left"/>
-      <w:pPr>
-        <w:ind w:left="1440" w:hanging="360"/>
-      </w:pPr>
-      <w:rPr>
-        <w:rFonts w:ascii="Symbol" w:hAnsi="Symbol" w:hint="default"/>
-      </w:rPr>
-    </w:lvl>
-    <w:lvl w:ilvl="4">
-      <w:start w:val="1"/>
-      <w:numFmt w:val="bullet"/>
-      <w:lvlText w:val=""/>
-      <w:lvlJc w:val="left"/>
-      <w:pPr>
-        <w:ind w:left="1800" w:hanging="360"/>
-      </w:pPr>
-      <w:rPr>
-        <w:rFonts w:ascii="Symbol" w:hAnsi="Symbol" w:hint="default"/>
-      </w:rPr>
-    </w:lvl>
-    <w:lvl w:ilvl="5">
-      <w:start w:val="1"/>
-      <w:numFmt w:val="bullet"/>
-      <w:lvlText w:val=""/>
-      <w:lvlJc w:val="left"/>
-      <w:pPr>
-        <w:ind w:left="2160" w:hanging="360"/>
-      </w:pPr>
-      <w:rPr>
-        <w:rFonts w:ascii="Wingdings" w:hAnsi="Wingdings" w:hint="default"/>
-      </w:rPr>
-    </w:lvl>
-    <w:lvl w:ilvl="6">
-      <w:start w:val="1"/>
-      <w:numFmt w:val="bullet"/>
-      <w:lvlText w:val=""/>
-      <w:lvlJc w:val="left"/>
-      <w:pPr>
-        <w:ind w:left="2520" w:hanging="360"/>
-      </w:pPr>
-      <w:rPr>
-        <w:rFonts w:ascii="Wingdings" w:hAnsi="Wingdings" w:hint="default"/>
-      </w:rPr>
-    </w:lvl>
-    <w:lvl w:ilvl="7">
-      <w:start w:val="1"/>
-      <w:numFmt w:val="bullet"/>
-      <w:lvlText w:val=""/>
-      <w:lvlJc w:val="left"/>
-      <w:pPr>
-        <w:ind w:left="2880" w:hanging="360"/>
-      </w:pPr>
-      <w:rPr>
-        <w:rFonts w:ascii="Symbol" w:hAnsi="Symbol" w:hint="default"/>
-      </w:rPr>
-    </w:lvl>
-    <w:lvl w:ilvl="8">
-      <w:start w:val="1"/>
-      <w:numFmt w:val="bullet"/>
-      <w:lvlText w:val=""/>
-      <w:lvlJc w:val="left"/>
-      <w:pPr>
-        <w:ind w:left="3240" w:hanging="360"/>
-      </w:pPr>
-      <w:rPr>
-        <w:rFonts w:ascii="Symbol" w:hAnsi="Symbol" w:hint="default"/>
-      </w:rPr>
-    </w:lvl>
-  </w:abstractNum>
-  <w:abstractNum w:abstractNumId="15" w15:restartNumberingAfterBreak="0">
+  <w:abstractNum w:abstractNumId="1" w15:restartNumberingAfterBreak="0">
     <w:nsid w:val="0A7C7405"/>
     <w:multiLevelType w:val="singleLevel"/>
     <w:tmpl w:val="92869324"/>
@@ -8064,233 +7764,7 @@
       </w:rPr>
     </w:lvl>
   </w:abstractNum>
-  <w:abstractNum w:abstractNumId="16" w15:restartNumberingAfterBreak="0">
-    <w:nsid w:val="100D77BA"/>
-    <w:multiLevelType w:val="hybridMultilevel"/>
-    <w:tmpl w:val="B8147694"/>
-    <w:lvl w:ilvl="0" w:tplc="100C0001">
-      <w:start w:val="1"/>
-      <w:numFmt w:val="bullet"/>
-      <w:lvlText w:val=""/>
-      <w:lvlJc w:val="left"/>
-      <w:pPr>
-        <w:ind w:left="814" w:hanging="360"/>
-      </w:pPr>
-      <w:rPr>
-        <w:rFonts w:ascii="Symbol" w:hAnsi="Symbol" w:hint="default"/>
-      </w:rPr>
-    </w:lvl>
-    <w:lvl w:ilvl="1" w:tplc="100C0003" w:tentative="1">
-      <w:start w:val="1"/>
-      <w:numFmt w:val="bullet"/>
-      <w:lvlText w:val="o"/>
-      <w:lvlJc w:val="left"/>
-      <w:pPr>
-        <w:ind w:left="1534" w:hanging="360"/>
-      </w:pPr>
-      <w:rPr>
-        <w:rFonts w:ascii="Courier New" w:hAnsi="Courier New" w:cs="Courier New" w:hint="default"/>
-      </w:rPr>
-    </w:lvl>
-    <w:lvl w:ilvl="2" w:tplc="100C0005" w:tentative="1">
-      <w:start w:val="1"/>
-      <w:numFmt w:val="bullet"/>
-      <w:lvlText w:val=""/>
-      <w:lvlJc w:val="left"/>
-      <w:pPr>
-        <w:ind w:left="2254" w:hanging="360"/>
-      </w:pPr>
-      <w:rPr>
-        <w:rFonts w:ascii="Wingdings" w:hAnsi="Wingdings" w:hint="default"/>
-      </w:rPr>
-    </w:lvl>
-    <w:lvl w:ilvl="3" w:tplc="100C0001" w:tentative="1">
-      <w:start w:val="1"/>
-      <w:numFmt w:val="bullet"/>
-      <w:lvlText w:val=""/>
-      <w:lvlJc w:val="left"/>
-      <w:pPr>
-        <w:ind w:left="2974" w:hanging="360"/>
-      </w:pPr>
-      <w:rPr>
-        <w:rFonts w:ascii="Symbol" w:hAnsi="Symbol" w:hint="default"/>
-      </w:rPr>
-    </w:lvl>
-    <w:lvl w:ilvl="4" w:tplc="100C0003" w:tentative="1">
-      <w:start w:val="1"/>
-      <w:numFmt w:val="bullet"/>
-      <w:lvlText w:val="o"/>
-      <w:lvlJc w:val="left"/>
-      <w:pPr>
-        <w:ind w:left="3694" w:hanging="360"/>
-      </w:pPr>
-      <w:rPr>
-        <w:rFonts w:ascii="Courier New" w:hAnsi="Courier New" w:cs="Courier New" w:hint="default"/>
-      </w:rPr>
-    </w:lvl>
-    <w:lvl w:ilvl="5" w:tplc="100C0005" w:tentative="1">
-      <w:start w:val="1"/>
-      <w:numFmt w:val="bullet"/>
-      <w:lvlText w:val=""/>
-      <w:lvlJc w:val="left"/>
-      <w:pPr>
-        <w:ind w:left="4414" w:hanging="360"/>
-      </w:pPr>
-      <w:rPr>
-        <w:rFonts w:ascii="Wingdings" w:hAnsi="Wingdings" w:hint="default"/>
-      </w:rPr>
-    </w:lvl>
-    <w:lvl w:ilvl="6" w:tplc="100C0001" w:tentative="1">
-      <w:start w:val="1"/>
-      <w:numFmt w:val="bullet"/>
-      <w:lvlText w:val=""/>
-      <w:lvlJc w:val="left"/>
-      <w:pPr>
-        <w:ind w:left="5134" w:hanging="360"/>
-      </w:pPr>
-      <w:rPr>
-        <w:rFonts w:ascii="Symbol" w:hAnsi="Symbol" w:hint="default"/>
-      </w:rPr>
-    </w:lvl>
-    <w:lvl w:ilvl="7" w:tplc="100C0003" w:tentative="1">
-      <w:start w:val="1"/>
-      <w:numFmt w:val="bullet"/>
-      <w:lvlText w:val="o"/>
-      <w:lvlJc w:val="left"/>
-      <w:pPr>
-        <w:ind w:left="5854" w:hanging="360"/>
-      </w:pPr>
-      <w:rPr>
-        <w:rFonts w:ascii="Courier New" w:hAnsi="Courier New" w:cs="Courier New" w:hint="default"/>
-      </w:rPr>
-    </w:lvl>
-    <w:lvl w:ilvl="8" w:tplc="100C0005" w:tentative="1">
-      <w:start w:val="1"/>
-      <w:numFmt w:val="bullet"/>
-      <w:lvlText w:val=""/>
-      <w:lvlJc w:val="left"/>
-      <w:pPr>
-        <w:ind w:left="6574" w:hanging="360"/>
-      </w:pPr>
-      <w:rPr>
-        <w:rFonts w:ascii="Wingdings" w:hAnsi="Wingdings" w:hint="default"/>
-      </w:rPr>
-    </w:lvl>
-  </w:abstractNum>
-  <w:abstractNum w:abstractNumId="17" w15:restartNumberingAfterBreak="0">
-    <w:nsid w:val="13386E8A"/>
-    <w:multiLevelType w:val="multilevel"/>
-    <w:tmpl w:val="100C0021"/>
-    <w:lvl w:ilvl="0">
-      <w:start w:val="1"/>
-      <w:numFmt w:val="bullet"/>
-      <w:lvlText w:val=""/>
-      <w:lvlJc w:val="left"/>
-      <w:pPr>
-        <w:ind w:left="360" w:hanging="360"/>
-      </w:pPr>
-      <w:rPr>
-        <w:rFonts w:ascii="Wingdings" w:hAnsi="Wingdings" w:hint="default"/>
-      </w:rPr>
-    </w:lvl>
-    <w:lvl w:ilvl="1">
-      <w:start w:val="1"/>
-      <w:numFmt w:val="bullet"/>
-      <w:lvlText w:val=""/>
-      <w:lvlJc w:val="left"/>
-      <w:pPr>
-        <w:ind w:left="720" w:hanging="360"/>
-      </w:pPr>
-      <w:rPr>
-        <w:rFonts w:ascii="Wingdings" w:hAnsi="Wingdings" w:hint="default"/>
-      </w:rPr>
-    </w:lvl>
-    <w:lvl w:ilvl="2">
-      <w:start w:val="1"/>
-      <w:numFmt w:val="bullet"/>
-      <w:lvlText w:val=""/>
-      <w:lvlJc w:val="left"/>
-      <w:pPr>
-        <w:ind w:left="1080" w:hanging="360"/>
-      </w:pPr>
-      <w:rPr>
-        <w:rFonts w:ascii="Wingdings" w:hAnsi="Wingdings" w:hint="default"/>
-      </w:rPr>
-    </w:lvl>
-    <w:lvl w:ilvl="3">
-      <w:start w:val="1"/>
-      <w:numFmt w:val="bullet"/>
-      <w:lvlText w:val=""/>
-      <w:lvlJc w:val="left"/>
-      <w:pPr>
-        <w:ind w:left="1440" w:hanging="360"/>
-      </w:pPr>
-      <w:rPr>
-        <w:rFonts w:ascii="Symbol" w:hAnsi="Symbol" w:hint="default"/>
-      </w:rPr>
-    </w:lvl>
-    <w:lvl w:ilvl="4">
-      <w:start w:val="1"/>
-      <w:numFmt w:val="bullet"/>
-      <w:lvlText w:val=""/>
-      <w:lvlJc w:val="left"/>
-      <w:pPr>
-        <w:ind w:left="1800" w:hanging="360"/>
-      </w:pPr>
-      <w:rPr>
-        <w:rFonts w:ascii="Symbol" w:hAnsi="Symbol" w:hint="default"/>
-      </w:rPr>
-    </w:lvl>
-    <w:lvl w:ilvl="5">
-      <w:start w:val="1"/>
-      <w:numFmt w:val="bullet"/>
-      <w:lvlText w:val=""/>
-      <w:lvlJc w:val="left"/>
-      <w:pPr>
-        <w:ind w:left="2160" w:hanging="360"/>
-      </w:pPr>
-      <w:rPr>
-        <w:rFonts w:ascii="Wingdings" w:hAnsi="Wingdings" w:hint="default"/>
-      </w:rPr>
-    </w:lvl>
-    <w:lvl w:ilvl="6">
-      <w:start w:val="1"/>
-      <w:numFmt w:val="bullet"/>
-      <w:lvlText w:val=""/>
-      <w:lvlJc w:val="left"/>
-      <w:pPr>
-        <w:ind w:left="2520" w:hanging="360"/>
-      </w:pPr>
-      <w:rPr>
-        <w:rFonts w:ascii="Wingdings" w:hAnsi="Wingdings" w:hint="default"/>
-      </w:rPr>
-    </w:lvl>
-    <w:lvl w:ilvl="7">
-      <w:start w:val="1"/>
-      <w:numFmt w:val="bullet"/>
-      <w:lvlText w:val=""/>
-      <w:lvlJc w:val="left"/>
-      <w:pPr>
-        <w:ind w:left="2880" w:hanging="360"/>
-      </w:pPr>
-      <w:rPr>
-        <w:rFonts w:ascii="Symbol" w:hAnsi="Symbol" w:hint="default"/>
-      </w:rPr>
-    </w:lvl>
-    <w:lvl w:ilvl="8">
-      <w:start w:val="1"/>
-      <w:numFmt w:val="bullet"/>
-      <w:lvlText w:val=""/>
-      <w:lvlJc w:val="left"/>
-      <w:pPr>
-        <w:ind w:left="3240" w:hanging="360"/>
-      </w:pPr>
-      <w:rPr>
-        <w:rFonts w:ascii="Symbol" w:hAnsi="Symbol" w:hint="default"/>
-      </w:rPr>
-    </w:lvl>
-  </w:abstractNum>
-  <w:abstractNum w:abstractNumId="18" w15:restartNumberingAfterBreak="0">
+  <w:abstractNum w:abstractNumId="2" w15:restartNumberingAfterBreak="0">
     <w:nsid w:val="13AB381A"/>
     <w:multiLevelType w:val="hybridMultilevel"/>
     <w:tmpl w:val="B43857E8"/>
@@ -8433,7 +7907,7 @@
       </w:rPr>
     </w:lvl>
   </w:abstractNum>
-  <w:abstractNum w:abstractNumId="19" w15:restartNumberingAfterBreak="0">
+  <w:abstractNum w:abstractNumId="3" w15:restartNumberingAfterBreak="0">
     <w:nsid w:val="20CB35C8"/>
     <w:multiLevelType w:val="hybridMultilevel"/>
     <w:tmpl w:val="2AA2EA56"/>
@@ -8546,7 +8020,7 @@
       </w:rPr>
     </w:lvl>
   </w:abstractNum>
-  <w:abstractNum w:abstractNumId="20" w15:restartNumberingAfterBreak="0">
+  <w:abstractNum w:abstractNumId="4" w15:restartNumberingAfterBreak="0">
     <w:nsid w:val="2A8F67FD"/>
     <w:multiLevelType w:val="multilevel"/>
     <w:tmpl w:val="08EA5668"/>
@@ -8689,120 +8163,7 @@
       </w:rPr>
     </w:lvl>
   </w:abstractNum>
-  <w:abstractNum w:abstractNumId="21" w15:restartNumberingAfterBreak="0">
-    <w:nsid w:val="2F2C5963"/>
-    <w:multiLevelType w:val="multilevel"/>
-    <w:tmpl w:val="E2569098"/>
-    <w:lvl w:ilvl="0">
-      <w:start w:val="1"/>
-      <w:numFmt w:val="decimal"/>
-      <w:lvlText w:val="%1."/>
-      <w:lvlJc w:val="left"/>
-      <w:pPr>
-        <w:tabs>
-          <w:tab w:val="num" w:pos="720"/>
-        </w:tabs>
-        <w:ind w:left="720" w:hanging="720"/>
-      </w:pPr>
-    </w:lvl>
-    <w:lvl w:ilvl="1">
-      <w:start w:val="1"/>
-      <w:numFmt w:val="decimal"/>
-      <w:lvlText w:val="%2."/>
-      <w:lvlJc w:val="left"/>
-      <w:pPr>
-        <w:tabs>
-          <w:tab w:val="num" w:pos="1440"/>
-        </w:tabs>
-        <w:ind w:left="1440" w:hanging="720"/>
-      </w:pPr>
-    </w:lvl>
-    <w:lvl w:ilvl="2">
-      <w:start w:val="1"/>
-      <w:numFmt w:val="decimal"/>
-      <w:lvlText w:val="%3."/>
-      <w:lvlJc w:val="left"/>
-      <w:pPr>
-        <w:tabs>
-          <w:tab w:val="num" w:pos="2160"/>
-        </w:tabs>
-        <w:ind w:left="2160" w:hanging="720"/>
-      </w:pPr>
-    </w:lvl>
-    <w:lvl w:ilvl="3">
-      <w:start w:val="1"/>
-      <w:numFmt w:val="decimal"/>
-      <w:lvlText w:val="%4."/>
-      <w:lvlJc w:val="left"/>
-      <w:pPr>
-        <w:tabs>
-          <w:tab w:val="num" w:pos="2880"/>
-        </w:tabs>
-        <w:ind w:left="2880" w:hanging="720"/>
-      </w:pPr>
-    </w:lvl>
-    <w:lvl w:ilvl="4">
-      <w:start w:val="1"/>
-      <w:numFmt w:val="decimal"/>
-      <w:lvlText w:val="%5."/>
-      <w:lvlJc w:val="left"/>
-      <w:pPr>
-        <w:tabs>
-          <w:tab w:val="num" w:pos="3600"/>
-        </w:tabs>
-        <w:ind w:left="3600" w:hanging="720"/>
-      </w:pPr>
-    </w:lvl>
-    <w:lvl w:ilvl="5">
-      <w:start w:val="1"/>
-      <w:numFmt w:val="decimal"/>
-      <w:lvlText w:val="%6."/>
-      <w:lvlJc w:val="left"/>
-      <w:pPr>
-        <w:tabs>
-          <w:tab w:val="num" w:pos="4320"/>
-        </w:tabs>
-        <w:ind w:left="4320" w:hanging="720"/>
-      </w:pPr>
-    </w:lvl>
-    <w:lvl w:ilvl="6">
-      <w:start w:val="1"/>
-      <w:numFmt w:val="decimal"/>
-      <w:lvlText w:val="%7."/>
-      <w:lvlJc w:val="left"/>
-      <w:pPr>
-        <w:tabs>
-          <w:tab w:val="num" w:pos="5040"/>
-        </w:tabs>
-        <w:ind w:left="5040" w:hanging="720"/>
-      </w:pPr>
-    </w:lvl>
-    <w:lvl w:ilvl="7">
-      <w:start w:val="1"/>
-      <w:numFmt w:val="decimal"/>
-      <w:lvlText w:val="%8."/>
-      <w:lvlJc w:val="left"/>
-      <w:pPr>
-        <w:tabs>
-          <w:tab w:val="num" w:pos="5760"/>
-        </w:tabs>
-        <w:ind w:left="5760" w:hanging="720"/>
-      </w:pPr>
-    </w:lvl>
-    <w:lvl w:ilvl="8">
-      <w:start w:val="1"/>
-      <w:numFmt w:val="decimal"/>
-      <w:lvlText w:val="%9."/>
-      <w:lvlJc w:val="left"/>
-      <w:pPr>
-        <w:tabs>
-          <w:tab w:val="num" w:pos="6480"/>
-        </w:tabs>
-        <w:ind w:left="6480" w:hanging="720"/>
-      </w:pPr>
-    </w:lvl>
-  </w:abstractNum>
-  <w:abstractNum w:abstractNumId="22" w15:restartNumberingAfterBreak="0">
+  <w:abstractNum w:abstractNumId="5" w15:restartNumberingAfterBreak="0">
     <w:nsid w:val="317E6F97"/>
     <w:multiLevelType w:val="hybridMultilevel"/>
     <w:tmpl w:val="2958751A"/>
@@ -8915,831 +8276,7 @@
       </w:rPr>
     </w:lvl>
   </w:abstractNum>
-  <w:abstractNum w:abstractNumId="23" w15:restartNumberingAfterBreak="0">
-    <w:nsid w:val="36506853"/>
-    <w:multiLevelType w:val="multilevel"/>
-    <w:tmpl w:val="2F6EF210"/>
-    <w:lvl w:ilvl="0">
-      <w:start w:val="1"/>
-      <w:numFmt w:val="bullet"/>
-      <w:lvlText w:val=""/>
-      <w:lvlJc w:val="left"/>
-      <w:pPr>
-        <w:ind w:left="360" w:hanging="360"/>
-      </w:pPr>
-      <w:rPr>
-        <w:rFonts w:ascii="Symbol" w:hAnsi="Symbol" w:hint="default"/>
-      </w:rPr>
-    </w:lvl>
-    <w:lvl w:ilvl="1">
-      <w:start w:val="1"/>
-      <w:numFmt w:val="bullet"/>
-      <w:lvlText w:val=""/>
-      <w:lvlJc w:val="left"/>
-      <w:pPr>
-        <w:ind w:left="720" w:hanging="360"/>
-      </w:pPr>
-      <w:rPr>
-        <w:rFonts w:ascii="Wingdings" w:hAnsi="Wingdings" w:hint="default"/>
-      </w:rPr>
-    </w:lvl>
-    <w:lvl w:ilvl="2">
-      <w:start w:val="1"/>
-      <w:numFmt w:val="bullet"/>
-      <w:lvlText w:val=""/>
-      <w:lvlJc w:val="left"/>
-      <w:pPr>
-        <w:ind w:left="1080" w:hanging="360"/>
-      </w:pPr>
-      <w:rPr>
-        <w:rFonts w:ascii="Wingdings" w:hAnsi="Wingdings" w:hint="default"/>
-      </w:rPr>
-    </w:lvl>
-    <w:lvl w:ilvl="3">
-      <w:start w:val="1"/>
-      <w:numFmt w:val="bullet"/>
-      <w:lvlText w:val=""/>
-      <w:lvlJc w:val="left"/>
-      <w:pPr>
-        <w:ind w:left="1440" w:hanging="360"/>
-      </w:pPr>
-      <w:rPr>
-        <w:rFonts w:ascii="Symbol" w:hAnsi="Symbol" w:hint="default"/>
-      </w:rPr>
-    </w:lvl>
-    <w:lvl w:ilvl="4">
-      <w:start w:val="1"/>
-      <w:numFmt w:val="bullet"/>
-      <w:lvlText w:val=""/>
-      <w:lvlJc w:val="left"/>
-      <w:pPr>
-        <w:ind w:left="1800" w:hanging="360"/>
-      </w:pPr>
-      <w:rPr>
-        <w:rFonts w:ascii="Symbol" w:hAnsi="Symbol" w:hint="default"/>
-      </w:rPr>
-    </w:lvl>
-    <w:lvl w:ilvl="5">
-      <w:start w:val="1"/>
-      <w:numFmt w:val="bullet"/>
-      <w:lvlText w:val=""/>
-      <w:lvlJc w:val="left"/>
-      <w:pPr>
-        <w:ind w:left="2160" w:hanging="360"/>
-      </w:pPr>
-      <w:rPr>
-        <w:rFonts w:ascii="Wingdings" w:hAnsi="Wingdings" w:hint="default"/>
-      </w:rPr>
-    </w:lvl>
-    <w:lvl w:ilvl="6">
-      <w:start w:val="1"/>
-      <w:numFmt w:val="bullet"/>
-      <w:lvlText w:val=""/>
-      <w:lvlJc w:val="left"/>
-      <w:pPr>
-        <w:ind w:left="2520" w:hanging="360"/>
-      </w:pPr>
-      <w:rPr>
-        <w:rFonts w:ascii="Wingdings" w:hAnsi="Wingdings" w:hint="default"/>
-      </w:rPr>
-    </w:lvl>
-    <w:lvl w:ilvl="7">
-      <w:start w:val="1"/>
-      <w:numFmt w:val="bullet"/>
-      <w:lvlText w:val=""/>
-      <w:lvlJc w:val="left"/>
-      <w:pPr>
-        <w:ind w:left="2880" w:hanging="360"/>
-      </w:pPr>
-      <w:rPr>
-        <w:rFonts w:ascii="Symbol" w:hAnsi="Symbol" w:hint="default"/>
-      </w:rPr>
-    </w:lvl>
-    <w:lvl w:ilvl="8">
-      <w:start w:val="1"/>
-      <w:numFmt w:val="bullet"/>
-      <w:lvlText w:val=""/>
-      <w:lvlJc w:val="left"/>
-      <w:pPr>
-        <w:ind w:left="3240" w:hanging="360"/>
-      </w:pPr>
-      <w:rPr>
-        <w:rFonts w:ascii="Symbol" w:hAnsi="Symbol" w:hint="default"/>
-      </w:rPr>
-    </w:lvl>
-  </w:abstractNum>
-  <w:abstractNum w:abstractNumId="24" w15:restartNumberingAfterBreak="0">
-    <w:nsid w:val="3BD16F36"/>
-    <w:multiLevelType w:val="multilevel"/>
-    <w:tmpl w:val="100C0021"/>
-    <w:lvl w:ilvl="0">
-      <w:start w:val="1"/>
-      <w:numFmt w:val="bullet"/>
-      <w:lvlText w:val=""/>
-      <w:lvlJc w:val="left"/>
-      <w:pPr>
-        <w:ind w:left="360" w:hanging="360"/>
-      </w:pPr>
-      <w:rPr>
-        <w:rFonts w:ascii="Wingdings" w:hAnsi="Wingdings" w:hint="default"/>
-      </w:rPr>
-    </w:lvl>
-    <w:lvl w:ilvl="1">
-      <w:start w:val="1"/>
-      <w:numFmt w:val="bullet"/>
-      <w:lvlText w:val=""/>
-      <w:lvlJc w:val="left"/>
-      <w:pPr>
-        <w:ind w:left="720" w:hanging="360"/>
-      </w:pPr>
-      <w:rPr>
-        <w:rFonts w:ascii="Wingdings" w:hAnsi="Wingdings" w:hint="default"/>
-      </w:rPr>
-    </w:lvl>
-    <w:lvl w:ilvl="2">
-      <w:start w:val="1"/>
-      <w:numFmt w:val="bullet"/>
-      <w:lvlText w:val=""/>
-      <w:lvlJc w:val="left"/>
-      <w:pPr>
-        <w:ind w:left="1080" w:hanging="360"/>
-      </w:pPr>
-      <w:rPr>
-        <w:rFonts w:ascii="Wingdings" w:hAnsi="Wingdings" w:hint="default"/>
-      </w:rPr>
-    </w:lvl>
-    <w:lvl w:ilvl="3">
-      <w:start w:val="1"/>
-      <w:numFmt w:val="bullet"/>
-      <w:lvlText w:val=""/>
-      <w:lvlJc w:val="left"/>
-      <w:pPr>
-        <w:ind w:left="1440" w:hanging="360"/>
-      </w:pPr>
-      <w:rPr>
-        <w:rFonts w:ascii="Symbol" w:hAnsi="Symbol" w:hint="default"/>
-      </w:rPr>
-    </w:lvl>
-    <w:lvl w:ilvl="4">
-      <w:start w:val="1"/>
-      <w:numFmt w:val="bullet"/>
-      <w:lvlText w:val=""/>
-      <w:lvlJc w:val="left"/>
-      <w:pPr>
-        <w:ind w:left="1800" w:hanging="360"/>
-      </w:pPr>
-      <w:rPr>
-        <w:rFonts w:ascii="Symbol" w:hAnsi="Symbol" w:hint="default"/>
-      </w:rPr>
-    </w:lvl>
-    <w:lvl w:ilvl="5">
-      <w:start w:val="1"/>
-      <w:numFmt w:val="bullet"/>
-      <w:lvlText w:val=""/>
-      <w:lvlJc w:val="left"/>
-      <w:pPr>
-        <w:ind w:left="2160" w:hanging="360"/>
-      </w:pPr>
-      <w:rPr>
-        <w:rFonts w:ascii="Wingdings" w:hAnsi="Wingdings" w:hint="default"/>
-      </w:rPr>
-    </w:lvl>
-    <w:lvl w:ilvl="6">
-      <w:start w:val="1"/>
-      <w:numFmt w:val="bullet"/>
-      <w:lvlText w:val=""/>
-      <w:lvlJc w:val="left"/>
-      <w:pPr>
-        <w:ind w:left="2520" w:hanging="360"/>
-      </w:pPr>
-      <w:rPr>
-        <w:rFonts w:ascii="Wingdings" w:hAnsi="Wingdings" w:hint="default"/>
-      </w:rPr>
-    </w:lvl>
-    <w:lvl w:ilvl="7">
-      <w:start w:val="1"/>
-      <w:numFmt w:val="bullet"/>
-      <w:lvlText w:val=""/>
-      <w:lvlJc w:val="left"/>
-      <w:pPr>
-        <w:ind w:left="2880" w:hanging="360"/>
-      </w:pPr>
-      <w:rPr>
-        <w:rFonts w:ascii="Symbol" w:hAnsi="Symbol" w:hint="default"/>
-      </w:rPr>
-    </w:lvl>
-    <w:lvl w:ilvl="8">
-      <w:start w:val="1"/>
-      <w:numFmt w:val="bullet"/>
-      <w:lvlText w:val=""/>
-      <w:lvlJc w:val="left"/>
-      <w:pPr>
-        <w:ind w:left="3240" w:hanging="360"/>
-      </w:pPr>
-      <w:rPr>
-        <w:rFonts w:ascii="Symbol" w:hAnsi="Symbol" w:hint="default"/>
-      </w:rPr>
-    </w:lvl>
-  </w:abstractNum>
-  <w:abstractNum w:abstractNumId="25" w15:restartNumberingAfterBreak="0">
-    <w:nsid w:val="3C361DED"/>
-    <w:multiLevelType w:val="multilevel"/>
-    <w:tmpl w:val="100C0021"/>
-    <w:lvl w:ilvl="0">
-      <w:start w:val="1"/>
-      <w:numFmt w:val="bullet"/>
-      <w:lvlText w:val=""/>
-      <w:lvlJc w:val="left"/>
-      <w:pPr>
-        <w:ind w:left="360" w:hanging="360"/>
-      </w:pPr>
-      <w:rPr>
-        <w:rFonts w:ascii="Wingdings" w:hAnsi="Wingdings" w:hint="default"/>
-      </w:rPr>
-    </w:lvl>
-    <w:lvl w:ilvl="1">
-      <w:start w:val="1"/>
-      <w:numFmt w:val="bullet"/>
-      <w:lvlText w:val=""/>
-      <w:lvlJc w:val="left"/>
-      <w:pPr>
-        <w:ind w:left="720" w:hanging="360"/>
-      </w:pPr>
-      <w:rPr>
-        <w:rFonts w:ascii="Wingdings" w:hAnsi="Wingdings" w:hint="default"/>
-      </w:rPr>
-    </w:lvl>
-    <w:lvl w:ilvl="2">
-      <w:start w:val="1"/>
-      <w:numFmt w:val="bullet"/>
-      <w:lvlText w:val=""/>
-      <w:lvlJc w:val="left"/>
-      <w:pPr>
-        <w:ind w:left="1080" w:hanging="360"/>
-      </w:pPr>
-      <w:rPr>
-        <w:rFonts w:ascii="Wingdings" w:hAnsi="Wingdings" w:hint="default"/>
-      </w:rPr>
-    </w:lvl>
-    <w:lvl w:ilvl="3">
-      <w:start w:val="1"/>
-      <w:numFmt w:val="bullet"/>
-      <w:lvlText w:val=""/>
-      <w:lvlJc w:val="left"/>
-      <w:pPr>
-        <w:ind w:left="1440" w:hanging="360"/>
-      </w:pPr>
-      <w:rPr>
-        <w:rFonts w:ascii="Symbol" w:hAnsi="Symbol" w:hint="default"/>
-      </w:rPr>
-    </w:lvl>
-    <w:lvl w:ilvl="4">
-      <w:start w:val="1"/>
-      <w:numFmt w:val="bullet"/>
-      <w:lvlText w:val=""/>
-      <w:lvlJc w:val="left"/>
-      <w:pPr>
-        <w:ind w:left="1800" w:hanging="360"/>
-      </w:pPr>
-      <w:rPr>
-        <w:rFonts w:ascii="Symbol" w:hAnsi="Symbol" w:hint="default"/>
-      </w:rPr>
-    </w:lvl>
-    <w:lvl w:ilvl="5">
-      <w:start w:val="1"/>
-      <w:numFmt w:val="bullet"/>
-      <w:lvlText w:val=""/>
-      <w:lvlJc w:val="left"/>
-      <w:pPr>
-        <w:ind w:left="2160" w:hanging="360"/>
-      </w:pPr>
-      <w:rPr>
-        <w:rFonts w:ascii="Wingdings" w:hAnsi="Wingdings" w:hint="default"/>
-      </w:rPr>
-    </w:lvl>
-    <w:lvl w:ilvl="6">
-      <w:start w:val="1"/>
-      <w:numFmt w:val="bullet"/>
-      <w:lvlText w:val=""/>
-      <w:lvlJc w:val="left"/>
-      <w:pPr>
-        <w:ind w:left="2520" w:hanging="360"/>
-      </w:pPr>
-      <w:rPr>
-        <w:rFonts w:ascii="Wingdings" w:hAnsi="Wingdings" w:hint="default"/>
-      </w:rPr>
-    </w:lvl>
-    <w:lvl w:ilvl="7">
-      <w:start w:val="1"/>
-      <w:numFmt w:val="bullet"/>
-      <w:lvlText w:val=""/>
-      <w:lvlJc w:val="left"/>
-      <w:pPr>
-        <w:ind w:left="2880" w:hanging="360"/>
-      </w:pPr>
-      <w:rPr>
-        <w:rFonts w:ascii="Symbol" w:hAnsi="Symbol" w:hint="default"/>
-      </w:rPr>
-    </w:lvl>
-    <w:lvl w:ilvl="8">
-      <w:start w:val="1"/>
-      <w:numFmt w:val="bullet"/>
-      <w:lvlText w:val=""/>
-      <w:lvlJc w:val="left"/>
-      <w:pPr>
-        <w:ind w:left="3240" w:hanging="360"/>
-      </w:pPr>
-      <w:rPr>
-        <w:rFonts w:ascii="Symbol" w:hAnsi="Symbol" w:hint="default"/>
-      </w:rPr>
-    </w:lvl>
-  </w:abstractNum>
-  <w:abstractNum w:abstractNumId="26" w15:restartNumberingAfterBreak="0">
-    <w:nsid w:val="3EF922F0"/>
-    <w:multiLevelType w:val="multilevel"/>
-    <w:tmpl w:val="100C0021"/>
-    <w:lvl w:ilvl="0">
-      <w:start w:val="1"/>
-      <w:numFmt w:val="bullet"/>
-      <w:lvlText w:val=""/>
-      <w:lvlJc w:val="left"/>
-      <w:pPr>
-        <w:ind w:left="360" w:hanging="360"/>
-      </w:pPr>
-      <w:rPr>
-        <w:rFonts w:ascii="Wingdings" w:hAnsi="Wingdings" w:hint="default"/>
-      </w:rPr>
-    </w:lvl>
-    <w:lvl w:ilvl="1">
-      <w:start w:val="1"/>
-      <w:numFmt w:val="bullet"/>
-      <w:lvlText w:val=""/>
-      <w:lvlJc w:val="left"/>
-      <w:pPr>
-        <w:ind w:left="720" w:hanging="360"/>
-      </w:pPr>
-      <w:rPr>
-        <w:rFonts w:ascii="Wingdings" w:hAnsi="Wingdings" w:hint="default"/>
-      </w:rPr>
-    </w:lvl>
-    <w:lvl w:ilvl="2">
-      <w:start w:val="1"/>
-      <w:numFmt w:val="bullet"/>
-      <w:lvlText w:val=""/>
-      <w:lvlJc w:val="left"/>
-      <w:pPr>
-        <w:ind w:left="1080" w:hanging="360"/>
-      </w:pPr>
-      <w:rPr>
-        <w:rFonts w:ascii="Wingdings" w:hAnsi="Wingdings" w:hint="default"/>
-      </w:rPr>
-    </w:lvl>
-    <w:lvl w:ilvl="3">
-      <w:start w:val="1"/>
-      <w:numFmt w:val="bullet"/>
-      <w:lvlText w:val=""/>
-      <w:lvlJc w:val="left"/>
-      <w:pPr>
-        <w:ind w:left="1440" w:hanging="360"/>
-      </w:pPr>
-      <w:rPr>
-        <w:rFonts w:ascii="Symbol" w:hAnsi="Symbol" w:hint="default"/>
-      </w:rPr>
-    </w:lvl>
-    <w:lvl w:ilvl="4">
-      <w:start w:val="1"/>
-      <w:numFmt w:val="bullet"/>
-      <w:lvlText w:val=""/>
-      <w:lvlJc w:val="left"/>
-      <w:pPr>
-        <w:ind w:left="1800" w:hanging="360"/>
-      </w:pPr>
-      <w:rPr>
-        <w:rFonts w:ascii="Symbol" w:hAnsi="Symbol" w:hint="default"/>
-      </w:rPr>
-    </w:lvl>
-    <w:lvl w:ilvl="5">
-      <w:start w:val="1"/>
-      <w:numFmt w:val="bullet"/>
-      <w:lvlText w:val=""/>
-      <w:lvlJc w:val="left"/>
-      <w:pPr>
-        <w:ind w:left="2160" w:hanging="360"/>
-      </w:pPr>
-      <w:rPr>
-        <w:rFonts w:ascii="Wingdings" w:hAnsi="Wingdings" w:hint="default"/>
-      </w:rPr>
-    </w:lvl>
-    <w:lvl w:ilvl="6">
-      <w:start w:val="1"/>
-      <w:numFmt w:val="bullet"/>
-      <w:lvlText w:val=""/>
-      <w:lvlJc w:val="left"/>
-      <w:pPr>
-        <w:ind w:left="2520" w:hanging="360"/>
-      </w:pPr>
-      <w:rPr>
-        <w:rFonts w:ascii="Wingdings" w:hAnsi="Wingdings" w:hint="default"/>
-      </w:rPr>
-    </w:lvl>
-    <w:lvl w:ilvl="7">
-      <w:start w:val="1"/>
-      <w:numFmt w:val="bullet"/>
-      <w:lvlText w:val=""/>
-      <w:lvlJc w:val="left"/>
-      <w:pPr>
-        <w:ind w:left="2880" w:hanging="360"/>
-      </w:pPr>
-      <w:rPr>
-        <w:rFonts w:ascii="Symbol" w:hAnsi="Symbol" w:hint="default"/>
-      </w:rPr>
-    </w:lvl>
-    <w:lvl w:ilvl="8">
-      <w:start w:val="1"/>
-      <w:numFmt w:val="bullet"/>
-      <w:lvlText w:val=""/>
-      <w:lvlJc w:val="left"/>
-      <w:pPr>
-        <w:ind w:left="3240" w:hanging="360"/>
-      </w:pPr>
-      <w:rPr>
-        <w:rFonts w:ascii="Symbol" w:hAnsi="Symbol" w:hint="default"/>
-      </w:rPr>
-    </w:lvl>
-  </w:abstractNum>
-  <w:abstractNum w:abstractNumId="27" w15:restartNumberingAfterBreak="0">
-    <w:nsid w:val="486164F4"/>
-    <w:multiLevelType w:val="multilevel"/>
-    <w:tmpl w:val="100C0021"/>
-    <w:lvl w:ilvl="0">
-      <w:start w:val="1"/>
-      <w:numFmt w:val="bullet"/>
-      <w:lvlText w:val=""/>
-      <w:lvlJc w:val="left"/>
-      <w:pPr>
-        <w:ind w:left="360" w:hanging="360"/>
-      </w:pPr>
-      <w:rPr>
-        <w:rFonts w:ascii="Wingdings" w:hAnsi="Wingdings" w:hint="default"/>
-      </w:rPr>
-    </w:lvl>
-    <w:lvl w:ilvl="1">
-      <w:start w:val="1"/>
-      <w:numFmt w:val="bullet"/>
-      <w:lvlText w:val=""/>
-      <w:lvlJc w:val="left"/>
-      <w:pPr>
-        <w:ind w:left="720" w:hanging="360"/>
-      </w:pPr>
-      <w:rPr>
-        <w:rFonts w:ascii="Wingdings" w:hAnsi="Wingdings" w:hint="default"/>
-      </w:rPr>
-    </w:lvl>
-    <w:lvl w:ilvl="2">
-      <w:start w:val="1"/>
-      <w:numFmt w:val="bullet"/>
-      <w:lvlText w:val=""/>
-      <w:lvlJc w:val="left"/>
-      <w:pPr>
-        <w:ind w:left="1080" w:hanging="360"/>
-      </w:pPr>
-      <w:rPr>
-        <w:rFonts w:ascii="Wingdings" w:hAnsi="Wingdings" w:hint="default"/>
-      </w:rPr>
-    </w:lvl>
-    <w:lvl w:ilvl="3">
-      <w:start w:val="1"/>
-      <w:numFmt w:val="bullet"/>
-      <w:lvlText w:val=""/>
-      <w:lvlJc w:val="left"/>
-      <w:pPr>
-        <w:ind w:left="1440" w:hanging="360"/>
-      </w:pPr>
-      <w:rPr>
-        <w:rFonts w:ascii="Symbol" w:hAnsi="Symbol" w:hint="default"/>
-      </w:rPr>
-    </w:lvl>
-    <w:lvl w:ilvl="4">
-      <w:start w:val="1"/>
-      <w:numFmt w:val="bullet"/>
-      <w:lvlText w:val=""/>
-      <w:lvlJc w:val="left"/>
-      <w:pPr>
-        <w:ind w:left="1800" w:hanging="360"/>
-      </w:pPr>
-      <w:rPr>
-        <w:rFonts w:ascii="Symbol" w:hAnsi="Symbol" w:hint="default"/>
-      </w:rPr>
-    </w:lvl>
-    <w:lvl w:ilvl="5">
-      <w:start w:val="1"/>
-      <w:numFmt w:val="bullet"/>
-      <w:lvlText w:val=""/>
-      <w:lvlJc w:val="left"/>
-      <w:pPr>
-        <w:ind w:left="2160" w:hanging="360"/>
-      </w:pPr>
-      <w:rPr>
-        <w:rFonts w:ascii="Wingdings" w:hAnsi="Wingdings" w:hint="default"/>
-      </w:rPr>
-    </w:lvl>
-    <w:lvl w:ilvl="6">
-      <w:start w:val="1"/>
-      <w:numFmt w:val="bullet"/>
-      <w:lvlText w:val=""/>
-      <w:lvlJc w:val="left"/>
-      <w:pPr>
-        <w:ind w:left="2520" w:hanging="360"/>
-      </w:pPr>
-      <w:rPr>
-        <w:rFonts w:ascii="Wingdings" w:hAnsi="Wingdings" w:hint="default"/>
-      </w:rPr>
-    </w:lvl>
-    <w:lvl w:ilvl="7">
-      <w:start w:val="1"/>
-      <w:numFmt w:val="bullet"/>
-      <w:lvlText w:val=""/>
-      <w:lvlJc w:val="left"/>
-      <w:pPr>
-        <w:ind w:left="2880" w:hanging="360"/>
-      </w:pPr>
-      <w:rPr>
-        <w:rFonts w:ascii="Symbol" w:hAnsi="Symbol" w:hint="default"/>
-      </w:rPr>
-    </w:lvl>
-    <w:lvl w:ilvl="8">
-      <w:start w:val="1"/>
-      <w:numFmt w:val="bullet"/>
-      <w:lvlText w:val=""/>
-      <w:lvlJc w:val="left"/>
-      <w:pPr>
-        <w:ind w:left="3240" w:hanging="360"/>
-      </w:pPr>
-      <w:rPr>
-        <w:rFonts w:ascii="Symbol" w:hAnsi="Symbol" w:hint="default"/>
-      </w:rPr>
-    </w:lvl>
-  </w:abstractNum>
-  <w:abstractNum w:abstractNumId="28" w15:restartNumberingAfterBreak="0">
-    <w:nsid w:val="4C4E14AC"/>
-    <w:multiLevelType w:val="multilevel"/>
-    <w:tmpl w:val="100C001F"/>
-    <w:lvl w:ilvl="0">
-      <w:start w:val="1"/>
-      <w:numFmt w:val="decimal"/>
-      <w:lvlText w:val="%1."/>
-      <w:lvlJc w:val="left"/>
-      <w:pPr>
-        <w:ind w:left="360" w:hanging="360"/>
-      </w:pPr>
-    </w:lvl>
-    <w:lvl w:ilvl="1">
-      <w:start w:val="1"/>
-      <w:numFmt w:val="decimal"/>
-      <w:lvlText w:val="%1.%2."/>
-      <w:lvlJc w:val="left"/>
-      <w:pPr>
-        <w:ind w:left="792" w:hanging="432"/>
-      </w:pPr>
-    </w:lvl>
-    <w:lvl w:ilvl="2">
-      <w:start w:val="1"/>
-      <w:numFmt w:val="decimal"/>
-      <w:lvlText w:val="%1.%2.%3."/>
-      <w:lvlJc w:val="left"/>
-      <w:pPr>
-        <w:ind w:left="1224" w:hanging="504"/>
-      </w:pPr>
-    </w:lvl>
-    <w:lvl w:ilvl="3">
-      <w:start w:val="1"/>
-      <w:numFmt w:val="decimal"/>
-      <w:lvlText w:val="%1.%2.%3.%4."/>
-      <w:lvlJc w:val="left"/>
-      <w:pPr>
-        <w:ind w:left="1728" w:hanging="648"/>
-      </w:pPr>
-    </w:lvl>
-    <w:lvl w:ilvl="4">
-      <w:start w:val="1"/>
-      <w:numFmt w:val="decimal"/>
-      <w:lvlText w:val="%1.%2.%3.%4.%5."/>
-      <w:lvlJc w:val="left"/>
-      <w:pPr>
-        <w:ind w:left="2232" w:hanging="792"/>
-      </w:pPr>
-    </w:lvl>
-    <w:lvl w:ilvl="5">
-      <w:start w:val="1"/>
-      <w:numFmt w:val="decimal"/>
-      <w:lvlText w:val="%1.%2.%3.%4.%5.%6."/>
-      <w:lvlJc w:val="left"/>
-      <w:pPr>
-        <w:ind w:left="2736" w:hanging="936"/>
-      </w:pPr>
-    </w:lvl>
-    <w:lvl w:ilvl="6">
-      <w:start w:val="1"/>
-      <w:numFmt w:val="decimal"/>
-      <w:lvlText w:val="%1.%2.%3.%4.%5.%6.%7."/>
-      <w:lvlJc w:val="left"/>
-      <w:pPr>
-        <w:ind w:left="3240" w:hanging="1080"/>
-      </w:pPr>
-    </w:lvl>
-    <w:lvl w:ilvl="7">
-      <w:start w:val="1"/>
-      <w:numFmt w:val="decimal"/>
-      <w:lvlText w:val="%1.%2.%3.%4.%5.%6.%7.%8."/>
-      <w:lvlJc w:val="left"/>
-      <w:pPr>
-        <w:ind w:left="3744" w:hanging="1224"/>
-      </w:pPr>
-    </w:lvl>
-    <w:lvl w:ilvl="8">
-      <w:start w:val="1"/>
-      <w:numFmt w:val="decimal"/>
-      <w:lvlText w:val="%1.%2.%3.%4.%5.%6.%7.%8.%9."/>
-      <w:lvlJc w:val="left"/>
-      <w:pPr>
-        <w:ind w:left="4320" w:hanging="1440"/>
-      </w:pPr>
-    </w:lvl>
-  </w:abstractNum>
-  <w:abstractNum w:abstractNumId="29" w15:restartNumberingAfterBreak="0">
-    <w:nsid w:val="4D30734E"/>
-    <w:multiLevelType w:val="multilevel"/>
-    <w:tmpl w:val="100C001D"/>
-    <w:lvl w:ilvl="0">
-      <w:start w:val="1"/>
-      <w:numFmt w:val="decimal"/>
-      <w:lvlText w:val="%1)"/>
-      <w:lvlJc w:val="left"/>
-      <w:pPr>
-        <w:ind w:left="360" w:hanging="360"/>
-      </w:pPr>
-    </w:lvl>
-    <w:lvl w:ilvl="1">
-      <w:start w:val="1"/>
-      <w:numFmt w:val="lowerLetter"/>
-      <w:lvlText w:val="%2)"/>
-      <w:lvlJc w:val="left"/>
-      <w:pPr>
-        <w:ind w:left="720" w:hanging="360"/>
-      </w:pPr>
-    </w:lvl>
-    <w:lvl w:ilvl="2">
-      <w:start w:val="1"/>
-      <w:numFmt w:val="lowerRoman"/>
-      <w:lvlText w:val="%3)"/>
-      <w:lvlJc w:val="left"/>
-      <w:pPr>
-        <w:ind w:left="1080" w:hanging="360"/>
-      </w:pPr>
-    </w:lvl>
-    <w:lvl w:ilvl="3">
-      <w:start w:val="1"/>
-      <w:numFmt w:val="decimal"/>
-      <w:lvlText w:val="(%4)"/>
-      <w:lvlJc w:val="left"/>
-      <w:pPr>
-        <w:ind w:left="1440" w:hanging="360"/>
-      </w:pPr>
-    </w:lvl>
-    <w:lvl w:ilvl="4">
-      <w:start w:val="1"/>
-      <w:numFmt w:val="lowerLetter"/>
-      <w:lvlText w:val="(%5)"/>
-      <w:lvlJc w:val="left"/>
-      <w:pPr>
-        <w:ind w:left="1800" w:hanging="360"/>
-      </w:pPr>
-    </w:lvl>
-    <w:lvl w:ilvl="5">
-      <w:start w:val="1"/>
-      <w:numFmt w:val="lowerRoman"/>
-      <w:lvlText w:val="(%6)"/>
-      <w:lvlJc w:val="left"/>
-      <w:pPr>
-        <w:ind w:left="2160" w:hanging="360"/>
-      </w:pPr>
-    </w:lvl>
-    <w:lvl w:ilvl="6">
-      <w:start w:val="1"/>
-      <w:numFmt w:val="decimal"/>
-      <w:lvlText w:val="%7."/>
-      <w:lvlJc w:val="left"/>
-      <w:pPr>
-        <w:ind w:left="2520" w:hanging="360"/>
-      </w:pPr>
-    </w:lvl>
-    <w:lvl w:ilvl="7">
-      <w:start w:val="1"/>
-      <w:numFmt w:val="lowerLetter"/>
-      <w:lvlText w:val="%8."/>
-      <w:lvlJc w:val="left"/>
-      <w:pPr>
-        <w:ind w:left="2880" w:hanging="360"/>
-      </w:pPr>
-    </w:lvl>
-    <w:lvl w:ilvl="8">
-      <w:start w:val="1"/>
-      <w:numFmt w:val="lowerRoman"/>
-      <w:lvlText w:val="%9."/>
-      <w:lvlJc w:val="left"/>
-      <w:pPr>
-        <w:ind w:left="3240" w:hanging="360"/>
-      </w:pPr>
-    </w:lvl>
-  </w:abstractNum>
-  <w:abstractNum w:abstractNumId="30" w15:restartNumberingAfterBreak="0">
-    <w:nsid w:val="55FE2729"/>
-    <w:multiLevelType w:val="multilevel"/>
-    <w:tmpl w:val="100C0023"/>
-    <w:lvl w:ilvl="0">
-      <w:start w:val="1"/>
-      <w:numFmt w:val="upperRoman"/>
-      <w:lvlText w:val="Article %1."/>
-      <w:lvlJc w:val="left"/>
-      <w:pPr>
-        <w:ind w:left="0" w:firstLine="0"/>
-      </w:pPr>
-    </w:lvl>
-    <w:lvl w:ilvl="1">
-      <w:start w:val="1"/>
-      <w:numFmt w:val="decimalZero"/>
-      <w:isLgl/>
-      <w:lvlText w:val="Section %1.%2"/>
-      <w:lvlJc w:val="left"/>
-      <w:pPr>
-        <w:ind w:left="0" w:firstLine="0"/>
-      </w:pPr>
-    </w:lvl>
-    <w:lvl w:ilvl="2">
-      <w:start w:val="1"/>
-      <w:numFmt w:val="lowerLetter"/>
-      <w:lvlText w:val="(%3)"/>
-      <w:lvlJc w:val="left"/>
-      <w:pPr>
-        <w:ind w:left="720" w:hanging="432"/>
-      </w:pPr>
-    </w:lvl>
-    <w:lvl w:ilvl="3">
-      <w:start w:val="1"/>
-      <w:numFmt w:val="lowerRoman"/>
-      <w:lvlText w:val="(%4)"/>
-      <w:lvlJc w:val="right"/>
-      <w:pPr>
-        <w:ind w:left="864" w:hanging="144"/>
-      </w:pPr>
-    </w:lvl>
-    <w:lvl w:ilvl="4">
-      <w:start w:val="1"/>
-      <w:numFmt w:val="decimal"/>
-      <w:lvlText w:val="%5)"/>
-      <w:lvlJc w:val="left"/>
-      <w:pPr>
-        <w:ind w:left="1008" w:hanging="432"/>
-      </w:pPr>
-    </w:lvl>
-    <w:lvl w:ilvl="5">
-      <w:start w:val="1"/>
-      <w:numFmt w:val="lowerLetter"/>
-      <w:lvlText w:val="%6)"/>
-      <w:lvlJc w:val="left"/>
-      <w:pPr>
-        <w:ind w:left="1152" w:hanging="432"/>
-      </w:pPr>
-    </w:lvl>
-    <w:lvl w:ilvl="6">
-      <w:start w:val="1"/>
-      <w:numFmt w:val="lowerRoman"/>
-      <w:lvlText w:val="%7)"/>
-      <w:lvlJc w:val="right"/>
-      <w:pPr>
-        <w:ind w:left="1296" w:hanging="288"/>
-      </w:pPr>
-    </w:lvl>
-    <w:lvl w:ilvl="7">
-      <w:start w:val="1"/>
-      <w:numFmt w:val="lowerLetter"/>
-      <w:lvlText w:val="%8."/>
-      <w:lvlJc w:val="left"/>
-      <w:pPr>
-        <w:ind w:left="1440" w:hanging="432"/>
-      </w:pPr>
-    </w:lvl>
-    <w:lvl w:ilvl="8">
-      <w:start w:val="1"/>
-      <w:numFmt w:val="lowerRoman"/>
-      <w:lvlText w:val="%9."/>
-      <w:lvlJc w:val="right"/>
-      <w:pPr>
-        <w:ind w:left="1584" w:hanging="144"/>
-      </w:pPr>
-    </w:lvl>
-  </w:abstractNum>
-  <w:abstractNum w:abstractNumId="31" w15:restartNumberingAfterBreak="0">
+  <w:abstractNum w:abstractNumId="6" w15:restartNumberingAfterBreak="0">
     <w:nsid w:val="566A7271"/>
     <w:multiLevelType w:val="multilevel"/>
     <w:tmpl w:val="3C8AFB84"/>
@@ -9888,885 +8425,7 @@
       </w:rPr>
     </w:lvl>
   </w:abstractNum>
-  <w:abstractNum w:abstractNumId="32" w15:restartNumberingAfterBreak="0">
-    <w:nsid w:val="58933B2A"/>
-    <w:multiLevelType w:val="multilevel"/>
-    <w:tmpl w:val="100C0021"/>
-    <w:lvl w:ilvl="0">
-      <w:start w:val="1"/>
-      <w:numFmt w:val="bullet"/>
-      <w:lvlText w:val=""/>
-      <w:lvlJc w:val="left"/>
-      <w:pPr>
-        <w:ind w:left="360" w:hanging="360"/>
-      </w:pPr>
-      <w:rPr>
-        <w:rFonts w:ascii="Wingdings" w:hAnsi="Wingdings" w:hint="default"/>
-      </w:rPr>
-    </w:lvl>
-    <w:lvl w:ilvl="1">
-      <w:start w:val="1"/>
-      <w:numFmt w:val="bullet"/>
-      <w:lvlText w:val=""/>
-      <w:lvlJc w:val="left"/>
-      <w:pPr>
-        <w:ind w:left="720" w:hanging="360"/>
-      </w:pPr>
-      <w:rPr>
-        <w:rFonts w:ascii="Wingdings" w:hAnsi="Wingdings" w:hint="default"/>
-      </w:rPr>
-    </w:lvl>
-    <w:lvl w:ilvl="2">
-      <w:start w:val="1"/>
-      <w:numFmt w:val="bullet"/>
-      <w:lvlText w:val=""/>
-      <w:lvlJc w:val="left"/>
-      <w:pPr>
-        <w:ind w:left="1080" w:hanging="360"/>
-      </w:pPr>
-      <w:rPr>
-        <w:rFonts w:ascii="Wingdings" w:hAnsi="Wingdings" w:hint="default"/>
-      </w:rPr>
-    </w:lvl>
-    <w:lvl w:ilvl="3">
-      <w:start w:val="1"/>
-      <w:numFmt w:val="bullet"/>
-      <w:lvlText w:val=""/>
-      <w:lvlJc w:val="left"/>
-      <w:pPr>
-        <w:ind w:left="1440" w:hanging="360"/>
-      </w:pPr>
-      <w:rPr>
-        <w:rFonts w:ascii="Symbol" w:hAnsi="Symbol" w:hint="default"/>
-      </w:rPr>
-    </w:lvl>
-    <w:lvl w:ilvl="4">
-      <w:start w:val="1"/>
-      <w:numFmt w:val="bullet"/>
-      <w:lvlText w:val=""/>
-      <w:lvlJc w:val="left"/>
-      <w:pPr>
-        <w:ind w:left="1800" w:hanging="360"/>
-      </w:pPr>
-      <w:rPr>
-        <w:rFonts w:ascii="Symbol" w:hAnsi="Symbol" w:hint="default"/>
-      </w:rPr>
-    </w:lvl>
-    <w:lvl w:ilvl="5">
-      <w:start w:val="1"/>
-      <w:numFmt w:val="bullet"/>
-      <w:lvlText w:val=""/>
-      <w:lvlJc w:val="left"/>
-      <w:pPr>
-        <w:ind w:left="2160" w:hanging="360"/>
-      </w:pPr>
-      <w:rPr>
-        <w:rFonts w:ascii="Wingdings" w:hAnsi="Wingdings" w:hint="default"/>
-      </w:rPr>
-    </w:lvl>
-    <w:lvl w:ilvl="6">
-      <w:start w:val="1"/>
-      <w:numFmt w:val="bullet"/>
-      <w:lvlText w:val=""/>
-      <w:lvlJc w:val="left"/>
-      <w:pPr>
-        <w:ind w:left="2520" w:hanging="360"/>
-      </w:pPr>
-      <w:rPr>
-        <w:rFonts w:ascii="Wingdings" w:hAnsi="Wingdings" w:hint="default"/>
-      </w:rPr>
-    </w:lvl>
-    <w:lvl w:ilvl="7">
-      <w:start w:val="1"/>
-      <w:numFmt w:val="bullet"/>
-      <w:lvlText w:val=""/>
-      <w:lvlJc w:val="left"/>
-      <w:pPr>
-        <w:ind w:left="2880" w:hanging="360"/>
-      </w:pPr>
-      <w:rPr>
-        <w:rFonts w:ascii="Symbol" w:hAnsi="Symbol" w:hint="default"/>
-      </w:rPr>
-    </w:lvl>
-    <w:lvl w:ilvl="8">
-      <w:start w:val="1"/>
-      <w:numFmt w:val="bullet"/>
-      <w:lvlText w:val=""/>
-      <w:lvlJc w:val="left"/>
-      <w:pPr>
-        <w:ind w:left="3240" w:hanging="360"/>
-      </w:pPr>
-      <w:rPr>
-        <w:rFonts w:ascii="Symbol" w:hAnsi="Symbol" w:hint="default"/>
-      </w:rPr>
-    </w:lvl>
-  </w:abstractNum>
-  <w:abstractNum w:abstractNumId="33" w15:restartNumberingAfterBreak="0">
-    <w:nsid w:val="5C877673"/>
-    <w:multiLevelType w:val="multilevel"/>
-    <w:tmpl w:val="100C0021"/>
-    <w:lvl w:ilvl="0">
-      <w:start w:val="1"/>
-      <w:numFmt w:val="bullet"/>
-      <w:lvlText w:val=""/>
-      <w:lvlJc w:val="left"/>
-      <w:pPr>
-        <w:ind w:left="360" w:hanging="360"/>
-      </w:pPr>
-      <w:rPr>
-        <w:rFonts w:ascii="Wingdings" w:hAnsi="Wingdings" w:hint="default"/>
-      </w:rPr>
-    </w:lvl>
-    <w:lvl w:ilvl="1">
-      <w:start w:val="1"/>
-      <w:numFmt w:val="bullet"/>
-      <w:lvlText w:val=""/>
-      <w:lvlJc w:val="left"/>
-      <w:pPr>
-        <w:ind w:left="720" w:hanging="360"/>
-      </w:pPr>
-      <w:rPr>
-        <w:rFonts w:ascii="Wingdings" w:hAnsi="Wingdings" w:hint="default"/>
-      </w:rPr>
-    </w:lvl>
-    <w:lvl w:ilvl="2">
-      <w:start w:val="1"/>
-      <w:numFmt w:val="bullet"/>
-      <w:lvlText w:val=""/>
-      <w:lvlJc w:val="left"/>
-      <w:pPr>
-        <w:ind w:left="1080" w:hanging="360"/>
-      </w:pPr>
-      <w:rPr>
-        <w:rFonts w:ascii="Wingdings" w:hAnsi="Wingdings" w:hint="default"/>
-      </w:rPr>
-    </w:lvl>
-    <w:lvl w:ilvl="3">
-      <w:start w:val="1"/>
-      <w:numFmt w:val="bullet"/>
-      <w:lvlText w:val=""/>
-      <w:lvlJc w:val="left"/>
-      <w:pPr>
-        <w:ind w:left="1440" w:hanging="360"/>
-      </w:pPr>
-      <w:rPr>
-        <w:rFonts w:ascii="Symbol" w:hAnsi="Symbol" w:hint="default"/>
-      </w:rPr>
-    </w:lvl>
-    <w:lvl w:ilvl="4">
-      <w:start w:val="1"/>
-      <w:numFmt w:val="bullet"/>
-      <w:lvlText w:val=""/>
-      <w:lvlJc w:val="left"/>
-      <w:pPr>
-        <w:ind w:left="1800" w:hanging="360"/>
-      </w:pPr>
-      <w:rPr>
-        <w:rFonts w:ascii="Symbol" w:hAnsi="Symbol" w:hint="default"/>
-      </w:rPr>
-    </w:lvl>
-    <w:lvl w:ilvl="5">
-      <w:start w:val="1"/>
-      <w:numFmt w:val="bullet"/>
-      <w:lvlText w:val=""/>
-      <w:lvlJc w:val="left"/>
-      <w:pPr>
-        <w:ind w:left="2160" w:hanging="360"/>
-      </w:pPr>
-      <w:rPr>
-        <w:rFonts w:ascii="Wingdings" w:hAnsi="Wingdings" w:hint="default"/>
-      </w:rPr>
-    </w:lvl>
-    <w:lvl w:ilvl="6">
-      <w:start w:val="1"/>
-      <w:numFmt w:val="bullet"/>
-      <w:lvlText w:val=""/>
-      <w:lvlJc w:val="left"/>
-      <w:pPr>
-        <w:ind w:left="2520" w:hanging="360"/>
-      </w:pPr>
-      <w:rPr>
-        <w:rFonts w:ascii="Wingdings" w:hAnsi="Wingdings" w:hint="default"/>
-      </w:rPr>
-    </w:lvl>
-    <w:lvl w:ilvl="7">
-      <w:start w:val="1"/>
-      <w:numFmt w:val="bullet"/>
-      <w:lvlText w:val=""/>
-      <w:lvlJc w:val="left"/>
-      <w:pPr>
-        <w:ind w:left="2880" w:hanging="360"/>
-      </w:pPr>
-      <w:rPr>
-        <w:rFonts w:ascii="Symbol" w:hAnsi="Symbol" w:hint="default"/>
-      </w:rPr>
-    </w:lvl>
-    <w:lvl w:ilvl="8">
-      <w:start w:val="1"/>
-      <w:numFmt w:val="bullet"/>
-      <w:lvlText w:val=""/>
-      <w:lvlJc w:val="left"/>
-      <w:pPr>
-        <w:ind w:left="3240" w:hanging="360"/>
-      </w:pPr>
-      <w:rPr>
-        <w:rFonts w:ascii="Symbol" w:hAnsi="Symbol" w:hint="default"/>
-      </w:rPr>
-    </w:lvl>
-  </w:abstractNum>
-  <w:abstractNum w:abstractNumId="34" w15:restartNumberingAfterBreak="0">
-    <w:nsid w:val="5CBC53EC"/>
-    <w:multiLevelType w:val="multilevel"/>
-    <w:tmpl w:val="2F6EF210"/>
-    <w:lvl w:ilvl="0">
-      <w:start w:val="1"/>
-      <w:numFmt w:val="bullet"/>
-      <w:lvlText w:val=""/>
-      <w:lvlJc w:val="left"/>
-      <w:pPr>
-        <w:ind w:left="360" w:hanging="360"/>
-      </w:pPr>
-      <w:rPr>
-        <w:rFonts w:ascii="Symbol" w:hAnsi="Symbol" w:hint="default"/>
-      </w:rPr>
-    </w:lvl>
-    <w:lvl w:ilvl="1">
-      <w:start w:val="1"/>
-      <w:numFmt w:val="bullet"/>
-      <w:lvlText w:val=""/>
-      <w:lvlJc w:val="left"/>
-      <w:pPr>
-        <w:ind w:left="720" w:hanging="360"/>
-      </w:pPr>
-      <w:rPr>
-        <w:rFonts w:ascii="Wingdings" w:hAnsi="Wingdings" w:hint="default"/>
-      </w:rPr>
-    </w:lvl>
-    <w:lvl w:ilvl="2">
-      <w:start w:val="1"/>
-      <w:numFmt w:val="bullet"/>
-      <w:lvlText w:val=""/>
-      <w:lvlJc w:val="left"/>
-      <w:pPr>
-        <w:ind w:left="1080" w:hanging="360"/>
-      </w:pPr>
-      <w:rPr>
-        <w:rFonts w:ascii="Wingdings" w:hAnsi="Wingdings" w:hint="default"/>
-      </w:rPr>
-    </w:lvl>
-    <w:lvl w:ilvl="3">
-      <w:start w:val="1"/>
-      <w:numFmt w:val="bullet"/>
-      <w:lvlText w:val=""/>
-      <w:lvlJc w:val="left"/>
-      <w:pPr>
-        <w:ind w:left="1440" w:hanging="360"/>
-      </w:pPr>
-      <w:rPr>
-        <w:rFonts w:ascii="Symbol" w:hAnsi="Symbol" w:hint="default"/>
-      </w:rPr>
-    </w:lvl>
-    <w:lvl w:ilvl="4">
-      <w:start w:val="1"/>
-      <w:numFmt w:val="bullet"/>
-      <w:lvlText w:val=""/>
-      <w:lvlJc w:val="left"/>
-      <w:pPr>
-        <w:ind w:left="1800" w:hanging="360"/>
-      </w:pPr>
-      <w:rPr>
-        <w:rFonts w:ascii="Symbol" w:hAnsi="Symbol" w:hint="default"/>
-      </w:rPr>
-    </w:lvl>
-    <w:lvl w:ilvl="5">
-      <w:start w:val="1"/>
-      <w:numFmt w:val="bullet"/>
-      <w:lvlText w:val=""/>
-      <w:lvlJc w:val="left"/>
-      <w:pPr>
-        <w:ind w:left="2160" w:hanging="360"/>
-      </w:pPr>
-      <w:rPr>
-        <w:rFonts w:ascii="Wingdings" w:hAnsi="Wingdings" w:hint="default"/>
-      </w:rPr>
-    </w:lvl>
-    <w:lvl w:ilvl="6">
-      <w:start w:val="1"/>
-      <w:numFmt w:val="bullet"/>
-      <w:lvlText w:val=""/>
-      <w:lvlJc w:val="left"/>
-      <w:pPr>
-        <w:ind w:left="2520" w:hanging="360"/>
-      </w:pPr>
-      <w:rPr>
-        <w:rFonts w:ascii="Wingdings" w:hAnsi="Wingdings" w:hint="default"/>
-      </w:rPr>
-    </w:lvl>
-    <w:lvl w:ilvl="7">
-      <w:start w:val="1"/>
-      <w:numFmt w:val="bullet"/>
-      <w:lvlText w:val=""/>
-      <w:lvlJc w:val="left"/>
-      <w:pPr>
-        <w:ind w:left="2880" w:hanging="360"/>
-      </w:pPr>
-      <w:rPr>
-        <w:rFonts w:ascii="Symbol" w:hAnsi="Symbol" w:hint="default"/>
-      </w:rPr>
-    </w:lvl>
-    <w:lvl w:ilvl="8">
-      <w:start w:val="1"/>
-      <w:numFmt w:val="bullet"/>
-      <w:lvlText w:val=""/>
-      <w:lvlJc w:val="left"/>
-      <w:pPr>
-        <w:ind w:left="3240" w:hanging="360"/>
-      </w:pPr>
-      <w:rPr>
-        <w:rFonts w:ascii="Symbol" w:hAnsi="Symbol" w:hint="default"/>
-      </w:rPr>
-    </w:lvl>
-  </w:abstractNum>
-  <w:abstractNum w:abstractNumId="35" w15:restartNumberingAfterBreak="0">
-    <w:nsid w:val="5E424682"/>
-    <w:multiLevelType w:val="multilevel"/>
-    <w:tmpl w:val="100C001F"/>
-    <w:lvl w:ilvl="0">
-      <w:start w:val="1"/>
-      <w:numFmt w:val="decimal"/>
-      <w:lvlText w:val="%1."/>
-      <w:lvlJc w:val="left"/>
-      <w:pPr>
-        <w:ind w:left="360" w:hanging="360"/>
-      </w:pPr>
-    </w:lvl>
-    <w:lvl w:ilvl="1">
-      <w:start w:val="1"/>
-      <w:numFmt w:val="decimal"/>
-      <w:lvlText w:val="%1.%2."/>
-      <w:lvlJc w:val="left"/>
-      <w:pPr>
-        <w:ind w:left="792" w:hanging="432"/>
-      </w:pPr>
-    </w:lvl>
-    <w:lvl w:ilvl="2">
-      <w:start w:val="1"/>
-      <w:numFmt w:val="decimal"/>
-      <w:lvlText w:val="%1.%2.%3."/>
-      <w:lvlJc w:val="left"/>
-      <w:pPr>
-        <w:ind w:left="1224" w:hanging="504"/>
-      </w:pPr>
-    </w:lvl>
-    <w:lvl w:ilvl="3">
-      <w:start w:val="1"/>
-      <w:numFmt w:val="decimal"/>
-      <w:lvlText w:val="%1.%2.%3.%4."/>
-      <w:lvlJc w:val="left"/>
-      <w:pPr>
-        <w:ind w:left="1728" w:hanging="648"/>
-      </w:pPr>
-    </w:lvl>
-    <w:lvl w:ilvl="4">
-      <w:start w:val="1"/>
-      <w:numFmt w:val="decimal"/>
-      <w:lvlText w:val="%1.%2.%3.%4.%5."/>
-      <w:lvlJc w:val="left"/>
-      <w:pPr>
-        <w:ind w:left="2232" w:hanging="792"/>
-      </w:pPr>
-    </w:lvl>
-    <w:lvl w:ilvl="5">
-      <w:start w:val="1"/>
-      <w:numFmt w:val="decimal"/>
-      <w:lvlText w:val="%1.%2.%3.%4.%5.%6."/>
-      <w:lvlJc w:val="left"/>
-      <w:pPr>
-        <w:ind w:left="2736" w:hanging="936"/>
-      </w:pPr>
-    </w:lvl>
-    <w:lvl w:ilvl="6">
-      <w:start w:val="1"/>
-      <w:numFmt w:val="decimal"/>
-      <w:lvlText w:val="%1.%2.%3.%4.%5.%6.%7."/>
-      <w:lvlJc w:val="left"/>
-      <w:pPr>
-        <w:ind w:left="3240" w:hanging="1080"/>
-      </w:pPr>
-    </w:lvl>
-    <w:lvl w:ilvl="7">
-      <w:start w:val="1"/>
-      <w:numFmt w:val="decimal"/>
-      <w:lvlText w:val="%1.%2.%3.%4.%5.%6.%7.%8."/>
-      <w:lvlJc w:val="left"/>
-      <w:pPr>
-        <w:ind w:left="3744" w:hanging="1224"/>
-      </w:pPr>
-    </w:lvl>
-    <w:lvl w:ilvl="8">
-      <w:start w:val="1"/>
-      <w:numFmt w:val="decimal"/>
-      <w:lvlText w:val="%1.%2.%3.%4.%5.%6.%7.%8.%9."/>
-      <w:lvlJc w:val="left"/>
-      <w:pPr>
-        <w:ind w:left="4320" w:hanging="1440"/>
-      </w:pPr>
-    </w:lvl>
-  </w:abstractNum>
-  <w:abstractNum w:abstractNumId="36" w15:restartNumberingAfterBreak="0">
-    <w:nsid w:val="63A9062F"/>
-    <w:multiLevelType w:val="multilevel"/>
-    <w:tmpl w:val="DCCE794A"/>
-    <w:lvl w:ilvl="0">
-      <w:start w:val="1"/>
-      <w:numFmt w:val="decimal"/>
-      <w:lvlText w:val="%1"/>
-      <w:lvlJc w:val="left"/>
-      <w:pPr>
-        <w:tabs>
-          <w:tab w:val="num" w:pos="454"/>
-        </w:tabs>
-        <w:ind w:left="454" w:hanging="454"/>
-      </w:pPr>
-      <w:rPr>
-        <w:rFonts w:hint="default"/>
-      </w:rPr>
-    </w:lvl>
-    <w:lvl w:ilvl="1">
-      <w:start w:val="1"/>
-      <w:numFmt w:val="decimal"/>
-      <w:lvlText w:val="%1.%2"/>
-      <w:lvlJc w:val="left"/>
-      <w:pPr>
-        <w:tabs>
-          <w:tab w:val="num" w:pos="907"/>
-        </w:tabs>
-        <w:ind w:left="907" w:hanging="453"/>
-      </w:pPr>
-      <w:rPr>
-        <w:rFonts w:hint="default"/>
-      </w:rPr>
-    </w:lvl>
-    <w:lvl w:ilvl="2">
-      <w:start w:val="1"/>
-      <w:numFmt w:val="decimal"/>
-      <w:lvlText w:val="%1.%2.%3"/>
-      <w:lvlJc w:val="left"/>
-      <w:pPr>
-        <w:tabs>
-          <w:tab w:val="num" w:pos="1361"/>
-        </w:tabs>
-        <w:ind w:left="1361" w:hanging="454"/>
-      </w:pPr>
-      <w:rPr>
-        <w:rFonts w:hint="default"/>
-      </w:rPr>
-    </w:lvl>
-    <w:lvl w:ilvl="3">
-      <w:start w:val="1"/>
-      <w:numFmt w:val="decimal"/>
-      <w:lvlText w:val="%1.%2.%3.%4"/>
-      <w:lvlJc w:val="left"/>
-      <w:pPr>
-        <w:tabs>
-          <w:tab w:val="num" w:pos="864"/>
-        </w:tabs>
-        <w:ind w:left="864" w:hanging="864"/>
-      </w:pPr>
-      <w:rPr>
-        <w:rFonts w:hint="default"/>
-      </w:rPr>
-    </w:lvl>
-    <w:lvl w:ilvl="4">
-      <w:start w:val="1"/>
-      <w:numFmt w:val="decimal"/>
-      <w:lvlText w:val="%1.%2.%3.%4.%5"/>
-      <w:lvlJc w:val="left"/>
-      <w:pPr>
-        <w:tabs>
-          <w:tab w:val="num" w:pos="1008"/>
-        </w:tabs>
-        <w:ind w:left="1008" w:hanging="1008"/>
-      </w:pPr>
-      <w:rPr>
-        <w:rFonts w:hint="default"/>
-      </w:rPr>
-    </w:lvl>
-    <w:lvl w:ilvl="5">
-      <w:start w:val="1"/>
-      <w:numFmt w:val="decimal"/>
-      <w:lvlText w:val="%1.%2.%3.%4.%5.%6"/>
-      <w:lvlJc w:val="left"/>
-      <w:pPr>
-        <w:tabs>
-          <w:tab w:val="num" w:pos="1152"/>
-        </w:tabs>
-        <w:ind w:left="1152" w:hanging="1152"/>
-      </w:pPr>
-      <w:rPr>
-        <w:rFonts w:hint="default"/>
-      </w:rPr>
-    </w:lvl>
-    <w:lvl w:ilvl="6">
-      <w:start w:val="1"/>
-      <w:numFmt w:val="decimal"/>
-      <w:lvlText w:val="%1.%2.%3.%4.%5.%6.%7"/>
-      <w:lvlJc w:val="left"/>
-      <w:pPr>
-        <w:tabs>
-          <w:tab w:val="num" w:pos="1296"/>
-        </w:tabs>
-        <w:ind w:left="1296" w:hanging="1296"/>
-      </w:pPr>
-      <w:rPr>
-        <w:rFonts w:hint="default"/>
-      </w:rPr>
-    </w:lvl>
-    <w:lvl w:ilvl="7">
-      <w:start w:val="1"/>
-      <w:numFmt w:val="decimal"/>
-      <w:lvlText w:val="%1.%2.%3.%4.%5.%6.%7.%8"/>
-      <w:lvlJc w:val="left"/>
-      <w:pPr>
-        <w:tabs>
-          <w:tab w:val="num" w:pos="1440"/>
-        </w:tabs>
-        <w:ind w:left="1440" w:hanging="1440"/>
-      </w:pPr>
-      <w:rPr>
-        <w:rFonts w:hint="default"/>
-      </w:rPr>
-    </w:lvl>
-    <w:lvl w:ilvl="8">
-      <w:start w:val="1"/>
-      <w:numFmt w:val="decimal"/>
-      <w:lvlText w:val="%1.%2.%3.%4.%5.%6.%7.%8.%9"/>
-      <w:lvlJc w:val="left"/>
-      <w:pPr>
-        <w:tabs>
-          <w:tab w:val="num" w:pos="1584"/>
-        </w:tabs>
-        <w:ind w:left="1584" w:hanging="1584"/>
-      </w:pPr>
-      <w:rPr>
-        <w:rFonts w:hint="default"/>
-      </w:rPr>
-    </w:lvl>
-  </w:abstractNum>
-  <w:abstractNum w:abstractNumId="37" w15:restartNumberingAfterBreak="0">
-    <w:nsid w:val="643F0961"/>
-    <w:multiLevelType w:val="multilevel"/>
-    <w:tmpl w:val="100C0021"/>
-    <w:lvl w:ilvl="0">
-      <w:start w:val="1"/>
-      <w:numFmt w:val="bullet"/>
-      <w:lvlText w:val=""/>
-      <w:lvlJc w:val="left"/>
-      <w:pPr>
-        <w:ind w:left="360" w:hanging="360"/>
-      </w:pPr>
-      <w:rPr>
-        <w:rFonts w:ascii="Wingdings" w:hAnsi="Wingdings" w:hint="default"/>
-      </w:rPr>
-    </w:lvl>
-    <w:lvl w:ilvl="1">
-      <w:start w:val="1"/>
-      <w:numFmt w:val="bullet"/>
-      <w:lvlText w:val=""/>
-      <w:lvlJc w:val="left"/>
-      <w:pPr>
-        <w:ind w:left="720" w:hanging="360"/>
-      </w:pPr>
-      <w:rPr>
-        <w:rFonts w:ascii="Wingdings" w:hAnsi="Wingdings" w:hint="default"/>
-      </w:rPr>
-    </w:lvl>
-    <w:lvl w:ilvl="2">
-      <w:start w:val="1"/>
-      <w:numFmt w:val="bullet"/>
-      <w:lvlText w:val=""/>
-      <w:lvlJc w:val="left"/>
-      <w:pPr>
-        <w:ind w:left="1080" w:hanging="360"/>
-      </w:pPr>
-      <w:rPr>
-        <w:rFonts w:ascii="Wingdings" w:hAnsi="Wingdings" w:hint="default"/>
-      </w:rPr>
-    </w:lvl>
-    <w:lvl w:ilvl="3">
-      <w:start w:val="1"/>
-      <w:numFmt w:val="bullet"/>
-      <w:lvlText w:val=""/>
-      <w:lvlJc w:val="left"/>
-      <w:pPr>
-        <w:ind w:left="1440" w:hanging="360"/>
-      </w:pPr>
-      <w:rPr>
-        <w:rFonts w:ascii="Symbol" w:hAnsi="Symbol" w:hint="default"/>
-      </w:rPr>
-    </w:lvl>
-    <w:lvl w:ilvl="4">
-      <w:start w:val="1"/>
-      <w:numFmt w:val="bullet"/>
-      <w:lvlText w:val=""/>
-      <w:lvlJc w:val="left"/>
-      <w:pPr>
-        <w:ind w:left="1800" w:hanging="360"/>
-      </w:pPr>
-      <w:rPr>
-        <w:rFonts w:ascii="Symbol" w:hAnsi="Symbol" w:hint="default"/>
-      </w:rPr>
-    </w:lvl>
-    <w:lvl w:ilvl="5">
-      <w:start w:val="1"/>
-      <w:numFmt w:val="bullet"/>
-      <w:lvlText w:val=""/>
-      <w:lvlJc w:val="left"/>
-      <w:pPr>
-        <w:ind w:left="2160" w:hanging="360"/>
-      </w:pPr>
-      <w:rPr>
-        <w:rFonts w:ascii="Wingdings" w:hAnsi="Wingdings" w:hint="default"/>
-      </w:rPr>
-    </w:lvl>
-    <w:lvl w:ilvl="6">
-      <w:start w:val="1"/>
-      <w:numFmt w:val="bullet"/>
-      <w:lvlText w:val=""/>
-      <w:lvlJc w:val="left"/>
-      <w:pPr>
-        <w:ind w:left="2520" w:hanging="360"/>
-      </w:pPr>
-      <w:rPr>
-        <w:rFonts w:ascii="Wingdings" w:hAnsi="Wingdings" w:hint="default"/>
-      </w:rPr>
-    </w:lvl>
-    <w:lvl w:ilvl="7">
-      <w:start w:val="1"/>
-      <w:numFmt w:val="bullet"/>
-      <w:lvlText w:val=""/>
-      <w:lvlJc w:val="left"/>
-      <w:pPr>
-        <w:ind w:left="2880" w:hanging="360"/>
-      </w:pPr>
-      <w:rPr>
-        <w:rFonts w:ascii="Symbol" w:hAnsi="Symbol" w:hint="default"/>
-      </w:rPr>
-    </w:lvl>
-    <w:lvl w:ilvl="8">
-      <w:start w:val="1"/>
-      <w:numFmt w:val="bullet"/>
-      <w:lvlText w:val=""/>
-      <w:lvlJc w:val="left"/>
-      <w:pPr>
-        <w:ind w:left="3240" w:hanging="360"/>
-      </w:pPr>
-      <w:rPr>
-        <w:rFonts w:ascii="Symbol" w:hAnsi="Symbol" w:hint="default"/>
-      </w:rPr>
-    </w:lvl>
-  </w:abstractNum>
-  <w:abstractNum w:abstractNumId="38" w15:restartNumberingAfterBreak="0">
-    <w:nsid w:val="6D6476B9"/>
-    <w:multiLevelType w:val="multilevel"/>
-    <w:tmpl w:val="100C0023"/>
-    <w:lvl w:ilvl="0">
-      <w:start w:val="1"/>
-      <w:numFmt w:val="upperRoman"/>
-      <w:lvlText w:val="Article %1."/>
-      <w:lvlJc w:val="left"/>
-      <w:pPr>
-        <w:ind w:left="0" w:firstLine="0"/>
-      </w:pPr>
-    </w:lvl>
-    <w:lvl w:ilvl="1">
-      <w:start w:val="1"/>
-      <w:numFmt w:val="decimalZero"/>
-      <w:isLgl/>
-      <w:lvlText w:val="Section %1.%2"/>
-      <w:lvlJc w:val="left"/>
-      <w:pPr>
-        <w:ind w:left="0" w:firstLine="0"/>
-      </w:pPr>
-    </w:lvl>
-    <w:lvl w:ilvl="2">
-      <w:start w:val="1"/>
-      <w:numFmt w:val="lowerLetter"/>
-      <w:lvlText w:val="(%3)"/>
-      <w:lvlJc w:val="left"/>
-      <w:pPr>
-        <w:ind w:left="720" w:hanging="432"/>
-      </w:pPr>
-    </w:lvl>
-    <w:lvl w:ilvl="3">
-      <w:start w:val="1"/>
-      <w:numFmt w:val="lowerRoman"/>
-      <w:lvlText w:val="(%4)"/>
-      <w:lvlJc w:val="right"/>
-      <w:pPr>
-        <w:ind w:left="864" w:hanging="144"/>
-      </w:pPr>
-    </w:lvl>
-    <w:lvl w:ilvl="4">
-      <w:start w:val="1"/>
-      <w:numFmt w:val="decimal"/>
-      <w:lvlText w:val="%5)"/>
-      <w:lvlJc w:val="left"/>
-      <w:pPr>
-        <w:ind w:left="1008" w:hanging="432"/>
-      </w:pPr>
-    </w:lvl>
-    <w:lvl w:ilvl="5">
-      <w:start w:val="1"/>
-      <w:numFmt w:val="lowerLetter"/>
-      <w:lvlText w:val="%6)"/>
-      <w:lvlJc w:val="left"/>
-      <w:pPr>
-        <w:ind w:left="1152" w:hanging="432"/>
-      </w:pPr>
-    </w:lvl>
-    <w:lvl w:ilvl="6">
-      <w:start w:val="1"/>
-      <w:numFmt w:val="lowerRoman"/>
-      <w:lvlText w:val="%7)"/>
-      <w:lvlJc w:val="right"/>
-      <w:pPr>
-        <w:ind w:left="1296" w:hanging="288"/>
-      </w:pPr>
-    </w:lvl>
-    <w:lvl w:ilvl="7">
-      <w:start w:val="1"/>
-      <w:numFmt w:val="lowerLetter"/>
-      <w:lvlText w:val="%8."/>
-      <w:lvlJc w:val="left"/>
-      <w:pPr>
-        <w:ind w:left="1440" w:hanging="432"/>
-      </w:pPr>
-    </w:lvl>
-    <w:lvl w:ilvl="8">
-      <w:start w:val="1"/>
-      <w:numFmt w:val="lowerRoman"/>
-      <w:lvlText w:val="%9."/>
-      <w:lvlJc w:val="right"/>
-      <w:pPr>
-        <w:ind w:left="1584" w:hanging="144"/>
-      </w:pPr>
-    </w:lvl>
-  </w:abstractNum>
-  <w:abstractNum w:abstractNumId="39" w15:restartNumberingAfterBreak="0">
-    <w:nsid w:val="70C03573"/>
-    <w:multiLevelType w:val="multilevel"/>
-    <w:tmpl w:val="100C0021"/>
-    <w:lvl w:ilvl="0">
-      <w:start w:val="1"/>
-      <w:numFmt w:val="bullet"/>
-      <w:lvlText w:val=""/>
-      <w:lvlJc w:val="left"/>
-      <w:pPr>
-        <w:ind w:left="360" w:hanging="360"/>
-      </w:pPr>
-      <w:rPr>
-        <w:rFonts w:ascii="Wingdings" w:hAnsi="Wingdings" w:hint="default"/>
-      </w:rPr>
-    </w:lvl>
-    <w:lvl w:ilvl="1">
-      <w:start w:val="1"/>
-      <w:numFmt w:val="bullet"/>
-      <w:lvlText w:val=""/>
-      <w:lvlJc w:val="left"/>
-      <w:pPr>
-        <w:ind w:left="720" w:hanging="360"/>
-      </w:pPr>
-      <w:rPr>
-        <w:rFonts w:ascii="Wingdings" w:hAnsi="Wingdings" w:hint="default"/>
-      </w:rPr>
-    </w:lvl>
-    <w:lvl w:ilvl="2">
-      <w:start w:val="1"/>
-      <w:numFmt w:val="bullet"/>
-      <w:lvlText w:val=""/>
-      <w:lvlJc w:val="left"/>
-      <w:pPr>
-        <w:ind w:left="1080" w:hanging="360"/>
-      </w:pPr>
-      <w:rPr>
-        <w:rFonts w:ascii="Wingdings" w:hAnsi="Wingdings" w:hint="default"/>
-      </w:rPr>
-    </w:lvl>
-    <w:lvl w:ilvl="3">
-      <w:start w:val="1"/>
-      <w:numFmt w:val="bullet"/>
-      <w:lvlText w:val=""/>
-      <w:lvlJc w:val="left"/>
-      <w:pPr>
-        <w:ind w:left="1440" w:hanging="360"/>
-      </w:pPr>
-      <w:rPr>
-        <w:rFonts w:ascii="Symbol" w:hAnsi="Symbol" w:hint="default"/>
-      </w:rPr>
-    </w:lvl>
-    <w:lvl w:ilvl="4">
-      <w:start w:val="1"/>
-      <w:numFmt w:val="bullet"/>
-      <w:lvlText w:val=""/>
-      <w:lvlJc w:val="left"/>
-      <w:pPr>
-        <w:ind w:left="1800" w:hanging="360"/>
-      </w:pPr>
-      <w:rPr>
-        <w:rFonts w:ascii="Symbol" w:hAnsi="Symbol" w:hint="default"/>
-      </w:rPr>
-    </w:lvl>
-    <w:lvl w:ilvl="5">
-      <w:start w:val="1"/>
-      <w:numFmt w:val="bullet"/>
-      <w:lvlText w:val=""/>
-      <w:lvlJc w:val="left"/>
-      <w:pPr>
-        <w:ind w:left="2160" w:hanging="360"/>
-      </w:pPr>
-      <w:rPr>
-        <w:rFonts w:ascii="Wingdings" w:hAnsi="Wingdings" w:hint="default"/>
-      </w:rPr>
-    </w:lvl>
-    <w:lvl w:ilvl="6">
-      <w:start w:val="1"/>
-      <w:numFmt w:val="bullet"/>
-      <w:lvlText w:val=""/>
-      <w:lvlJc w:val="left"/>
-      <w:pPr>
-        <w:ind w:left="2520" w:hanging="360"/>
-      </w:pPr>
-      <w:rPr>
-        <w:rFonts w:ascii="Wingdings" w:hAnsi="Wingdings" w:hint="default"/>
-      </w:rPr>
-    </w:lvl>
-    <w:lvl w:ilvl="7">
-      <w:start w:val="1"/>
-      <w:numFmt w:val="bullet"/>
-      <w:lvlText w:val=""/>
-      <w:lvlJc w:val="left"/>
-      <w:pPr>
-        <w:ind w:left="2880" w:hanging="360"/>
-      </w:pPr>
-      <w:rPr>
-        <w:rFonts w:ascii="Symbol" w:hAnsi="Symbol" w:hint="default"/>
-      </w:rPr>
-    </w:lvl>
-    <w:lvl w:ilvl="8">
-      <w:start w:val="1"/>
-      <w:numFmt w:val="bullet"/>
-      <w:lvlText w:val=""/>
-      <w:lvlJc w:val="left"/>
-      <w:pPr>
-        <w:ind w:left="3240" w:hanging="360"/>
-      </w:pPr>
-      <w:rPr>
-        <w:rFonts w:ascii="Symbol" w:hAnsi="Symbol" w:hint="default"/>
-      </w:rPr>
-    </w:lvl>
-  </w:abstractNum>
-  <w:abstractNum w:abstractNumId="40" w15:restartNumberingAfterBreak="0">
+  <w:abstractNum w:abstractNumId="7" w15:restartNumberingAfterBreak="0">
     <w:nsid w:val="741D55A0"/>
     <w:multiLevelType w:val="hybridMultilevel"/>
     <w:tmpl w:val="875EC30E"/>
@@ -10879,383 +8538,43 @@
       </w:rPr>
     </w:lvl>
   </w:abstractNum>
-  <w:abstractNum w:abstractNumId="41" w15:restartNumberingAfterBreak="0">
-    <w:nsid w:val="79CD09A9"/>
-    <w:multiLevelType w:val="multilevel"/>
-    <w:tmpl w:val="100C0021"/>
-    <w:lvl w:ilvl="0">
-      <w:start w:val="1"/>
-      <w:numFmt w:val="bullet"/>
-      <w:lvlText w:val=""/>
-      <w:lvlJc w:val="left"/>
-      <w:pPr>
-        <w:ind w:left="360" w:hanging="360"/>
-      </w:pPr>
-      <w:rPr>
-        <w:rFonts w:ascii="Wingdings" w:hAnsi="Wingdings" w:hint="default"/>
-      </w:rPr>
-    </w:lvl>
-    <w:lvl w:ilvl="1">
-      <w:start w:val="1"/>
-      <w:numFmt w:val="bullet"/>
-      <w:lvlText w:val=""/>
-      <w:lvlJc w:val="left"/>
-      <w:pPr>
-        <w:ind w:left="720" w:hanging="360"/>
-      </w:pPr>
-      <w:rPr>
-        <w:rFonts w:ascii="Wingdings" w:hAnsi="Wingdings" w:hint="default"/>
-      </w:rPr>
-    </w:lvl>
-    <w:lvl w:ilvl="2">
-      <w:start w:val="1"/>
-      <w:numFmt w:val="bullet"/>
-      <w:lvlText w:val=""/>
-      <w:lvlJc w:val="left"/>
-      <w:pPr>
-        <w:ind w:left="1080" w:hanging="360"/>
-      </w:pPr>
-      <w:rPr>
-        <w:rFonts w:ascii="Wingdings" w:hAnsi="Wingdings" w:hint="default"/>
-      </w:rPr>
-    </w:lvl>
-    <w:lvl w:ilvl="3">
-      <w:start w:val="1"/>
-      <w:numFmt w:val="bullet"/>
-      <w:lvlText w:val=""/>
-      <w:lvlJc w:val="left"/>
-      <w:pPr>
-        <w:ind w:left="1440" w:hanging="360"/>
-      </w:pPr>
-      <w:rPr>
-        <w:rFonts w:ascii="Symbol" w:hAnsi="Symbol" w:hint="default"/>
-      </w:rPr>
-    </w:lvl>
-    <w:lvl w:ilvl="4">
-      <w:start w:val="1"/>
-      <w:numFmt w:val="bullet"/>
-      <w:lvlText w:val=""/>
-      <w:lvlJc w:val="left"/>
-      <w:pPr>
-        <w:ind w:left="1800" w:hanging="360"/>
-      </w:pPr>
-      <w:rPr>
-        <w:rFonts w:ascii="Symbol" w:hAnsi="Symbol" w:hint="default"/>
-      </w:rPr>
-    </w:lvl>
-    <w:lvl w:ilvl="5">
-      <w:start w:val="1"/>
-      <w:numFmt w:val="bullet"/>
-      <w:lvlText w:val=""/>
-      <w:lvlJc w:val="left"/>
-      <w:pPr>
-        <w:ind w:left="2160" w:hanging="360"/>
-      </w:pPr>
-      <w:rPr>
-        <w:rFonts w:ascii="Wingdings" w:hAnsi="Wingdings" w:hint="default"/>
-      </w:rPr>
-    </w:lvl>
-    <w:lvl w:ilvl="6">
-      <w:start w:val="1"/>
-      <w:numFmt w:val="bullet"/>
-      <w:lvlText w:val=""/>
-      <w:lvlJc w:val="left"/>
-      <w:pPr>
-        <w:ind w:left="2520" w:hanging="360"/>
-      </w:pPr>
-      <w:rPr>
-        <w:rFonts w:ascii="Wingdings" w:hAnsi="Wingdings" w:hint="default"/>
-      </w:rPr>
-    </w:lvl>
-    <w:lvl w:ilvl="7">
-      <w:start w:val="1"/>
-      <w:numFmt w:val="bullet"/>
-      <w:lvlText w:val=""/>
-      <w:lvlJc w:val="left"/>
-      <w:pPr>
-        <w:ind w:left="2880" w:hanging="360"/>
-      </w:pPr>
-      <w:rPr>
-        <w:rFonts w:ascii="Symbol" w:hAnsi="Symbol" w:hint="default"/>
-      </w:rPr>
-    </w:lvl>
-    <w:lvl w:ilvl="8">
-      <w:start w:val="1"/>
-      <w:numFmt w:val="bullet"/>
-      <w:lvlText w:val=""/>
-      <w:lvlJc w:val="left"/>
-      <w:pPr>
-        <w:ind w:left="3240" w:hanging="360"/>
-      </w:pPr>
-      <w:rPr>
-        <w:rFonts w:ascii="Symbol" w:hAnsi="Symbol" w:hint="default"/>
-      </w:rPr>
-    </w:lvl>
-  </w:abstractNum>
-  <w:abstractNum w:abstractNumId="42" w15:restartNumberingAfterBreak="0">
-    <w:nsid w:val="7E7F1C51"/>
-    <w:multiLevelType w:val="multilevel"/>
-    <w:tmpl w:val="100C0021"/>
-    <w:lvl w:ilvl="0">
-      <w:start w:val="1"/>
-      <w:numFmt w:val="bullet"/>
-      <w:lvlText w:val=""/>
-      <w:lvlJc w:val="left"/>
-      <w:pPr>
-        <w:ind w:left="360" w:hanging="360"/>
-      </w:pPr>
-      <w:rPr>
-        <w:rFonts w:ascii="Wingdings" w:hAnsi="Wingdings" w:hint="default"/>
-      </w:rPr>
-    </w:lvl>
-    <w:lvl w:ilvl="1">
-      <w:start w:val="1"/>
-      <w:numFmt w:val="bullet"/>
-      <w:lvlText w:val=""/>
-      <w:lvlJc w:val="left"/>
-      <w:pPr>
-        <w:ind w:left="720" w:hanging="360"/>
-      </w:pPr>
-      <w:rPr>
-        <w:rFonts w:ascii="Wingdings" w:hAnsi="Wingdings" w:hint="default"/>
-      </w:rPr>
-    </w:lvl>
-    <w:lvl w:ilvl="2">
-      <w:start w:val="1"/>
-      <w:numFmt w:val="bullet"/>
-      <w:lvlText w:val=""/>
-      <w:lvlJc w:val="left"/>
-      <w:pPr>
-        <w:ind w:left="1080" w:hanging="360"/>
-      </w:pPr>
-      <w:rPr>
-        <w:rFonts w:ascii="Wingdings" w:hAnsi="Wingdings" w:hint="default"/>
-      </w:rPr>
-    </w:lvl>
-    <w:lvl w:ilvl="3">
-      <w:start w:val="1"/>
-      <w:numFmt w:val="bullet"/>
-      <w:lvlText w:val=""/>
-      <w:lvlJc w:val="left"/>
-      <w:pPr>
-        <w:ind w:left="1440" w:hanging="360"/>
-      </w:pPr>
-      <w:rPr>
-        <w:rFonts w:ascii="Symbol" w:hAnsi="Symbol" w:hint="default"/>
-      </w:rPr>
-    </w:lvl>
-    <w:lvl w:ilvl="4">
-      <w:start w:val="1"/>
-      <w:numFmt w:val="bullet"/>
-      <w:lvlText w:val=""/>
-      <w:lvlJc w:val="left"/>
-      <w:pPr>
-        <w:ind w:left="1800" w:hanging="360"/>
-      </w:pPr>
-      <w:rPr>
-        <w:rFonts w:ascii="Symbol" w:hAnsi="Symbol" w:hint="default"/>
-      </w:rPr>
-    </w:lvl>
-    <w:lvl w:ilvl="5">
-      <w:start w:val="1"/>
-      <w:numFmt w:val="bullet"/>
-      <w:lvlText w:val=""/>
-      <w:lvlJc w:val="left"/>
-      <w:pPr>
-        <w:ind w:left="2160" w:hanging="360"/>
-      </w:pPr>
-      <w:rPr>
-        <w:rFonts w:ascii="Wingdings" w:hAnsi="Wingdings" w:hint="default"/>
-      </w:rPr>
-    </w:lvl>
-    <w:lvl w:ilvl="6">
-      <w:start w:val="1"/>
-      <w:numFmt w:val="bullet"/>
-      <w:lvlText w:val=""/>
-      <w:lvlJc w:val="left"/>
-      <w:pPr>
-        <w:ind w:left="2520" w:hanging="360"/>
-      </w:pPr>
-      <w:rPr>
-        <w:rFonts w:ascii="Wingdings" w:hAnsi="Wingdings" w:hint="default"/>
-      </w:rPr>
-    </w:lvl>
-    <w:lvl w:ilvl="7">
-      <w:start w:val="1"/>
-      <w:numFmt w:val="bullet"/>
-      <w:lvlText w:val=""/>
-      <w:lvlJc w:val="left"/>
-      <w:pPr>
-        <w:ind w:left="2880" w:hanging="360"/>
-      </w:pPr>
-      <w:rPr>
-        <w:rFonts w:ascii="Symbol" w:hAnsi="Symbol" w:hint="default"/>
-      </w:rPr>
-    </w:lvl>
-    <w:lvl w:ilvl="8">
-      <w:start w:val="1"/>
-      <w:numFmt w:val="bullet"/>
-      <w:lvlText w:val=""/>
-      <w:lvlJc w:val="left"/>
-      <w:pPr>
-        <w:ind w:left="3240" w:hanging="360"/>
-      </w:pPr>
-      <w:rPr>
-        <w:rFonts w:ascii="Symbol" w:hAnsi="Symbol" w:hint="default"/>
-      </w:rPr>
-    </w:lvl>
-  </w:abstractNum>
   <w:num w:numId="1" w16cid:durableId="194120611">
-    <w:abstractNumId w:val="11"/>
+    <w:abstractNumId w:val="0"/>
   </w:num>
   <w:num w:numId="2" w16cid:durableId="41054799">
-    <w:abstractNumId w:val="18"/>
+    <w:abstractNumId w:val="2"/>
   </w:num>
   <w:num w:numId="3" w16cid:durableId="668867103">
-    <w:abstractNumId w:val="15"/>
+    <w:abstractNumId w:val="1"/>
   </w:num>
-  <w:num w:numId="4" w16cid:durableId="1726176857">
-    <w:abstractNumId w:val="36"/>
+  <w:num w:numId="4" w16cid:durableId="1328905520">
+    <w:abstractNumId w:val="4"/>
   </w:num>
-  <w:num w:numId="5" w16cid:durableId="931595623">
-    <w:abstractNumId w:val="36"/>
-  </w:num>
-  <w:num w:numId="6" w16cid:durableId="771433986">
-    <w:abstractNumId w:val="15"/>
-  </w:num>
-  <w:num w:numId="7" w16cid:durableId="2127039636">
-    <w:abstractNumId w:val="15"/>
-  </w:num>
-  <w:num w:numId="8" w16cid:durableId="1406103511">
-    <w:abstractNumId w:val="15"/>
-  </w:num>
-  <w:num w:numId="9" w16cid:durableId="1064184604">
-    <w:abstractNumId w:val="15"/>
-  </w:num>
-  <w:num w:numId="10" w16cid:durableId="263802688">
-    <w:abstractNumId w:val="36"/>
-  </w:num>
-  <w:num w:numId="11" w16cid:durableId="1142699777">
-    <w:abstractNumId w:val="15"/>
-  </w:num>
-  <w:num w:numId="12" w16cid:durableId="574821490">
-    <w:abstractNumId w:val="21"/>
-  </w:num>
-  <w:num w:numId="13" w16cid:durableId="1328905520">
-    <w:abstractNumId w:val="20"/>
-  </w:num>
-  <w:num w:numId="14" w16cid:durableId="1702705906">
-    <w:abstractNumId w:val="19"/>
-  </w:num>
-  <w:num w:numId="15" w16cid:durableId="1167985156">
-    <w:abstractNumId w:val="16"/>
-  </w:num>
-  <w:num w:numId="16" w16cid:durableId="23218484">
-    <w:abstractNumId w:val="33"/>
-  </w:num>
-  <w:num w:numId="17" w16cid:durableId="178786374">
-    <w:abstractNumId w:val="27"/>
-  </w:num>
-  <w:num w:numId="18" w16cid:durableId="124473500">
-    <w:abstractNumId w:val="42"/>
-  </w:num>
-  <w:num w:numId="19" w16cid:durableId="731150296">
-    <w:abstractNumId w:val="39"/>
-  </w:num>
-  <w:num w:numId="20" w16cid:durableId="2071147799">
-    <w:abstractNumId w:val="10"/>
-  </w:num>
-  <w:num w:numId="21" w16cid:durableId="42606908">
-    <w:abstractNumId w:val="37"/>
-  </w:num>
-  <w:num w:numId="22" w16cid:durableId="1350521513">
-    <w:abstractNumId w:val="26"/>
-  </w:num>
-  <w:num w:numId="23" w16cid:durableId="1859852813">
-    <w:abstractNumId w:val="24"/>
-  </w:num>
-  <w:num w:numId="24" w16cid:durableId="533809039">
-    <w:abstractNumId w:val="13"/>
-  </w:num>
-  <w:num w:numId="25" w16cid:durableId="886139545">
-    <w:abstractNumId w:val="17"/>
-  </w:num>
-  <w:num w:numId="26" w16cid:durableId="2042316309">
-    <w:abstractNumId w:val="12"/>
-  </w:num>
-  <w:num w:numId="27" w16cid:durableId="1464159145">
-    <w:abstractNumId w:val="32"/>
-  </w:num>
-  <w:num w:numId="28" w16cid:durableId="1517035488">
-    <w:abstractNumId w:val="35"/>
-  </w:num>
-  <w:num w:numId="29" w16cid:durableId="1153792273">
-    <w:abstractNumId w:val="29"/>
-  </w:num>
-  <w:num w:numId="30" w16cid:durableId="2045591710">
-    <w:abstractNumId w:val="30"/>
-  </w:num>
-  <w:num w:numId="31" w16cid:durableId="1721661599">
-    <w:abstractNumId w:val="38"/>
-  </w:num>
-  <w:num w:numId="32" w16cid:durableId="2033215344">
-    <w:abstractNumId w:val="8"/>
-  </w:num>
-  <w:num w:numId="33" w16cid:durableId="476385663">
+  <w:num w:numId="5" w16cid:durableId="1702705906">
     <w:abstractNumId w:val="3"/>
   </w:num>
-  <w:num w:numId="34" w16cid:durableId="1261334317">
-    <w:abstractNumId w:val="2"/>
-  </w:num>
-  <w:num w:numId="35" w16cid:durableId="1656029499">
-    <w:abstractNumId w:val="1"/>
-  </w:num>
-  <w:num w:numId="36" w16cid:durableId="1510095618">
-    <w:abstractNumId w:val="0"/>
-  </w:num>
-  <w:num w:numId="37" w16cid:durableId="1264387726">
-    <w:abstractNumId w:val="9"/>
-  </w:num>
-  <w:num w:numId="38" w16cid:durableId="1438712732">
+  <w:num w:numId="6" w16cid:durableId="812334162">
     <w:abstractNumId w:val="7"/>
   </w:num>
-  <w:num w:numId="39" w16cid:durableId="1712683352">
+  <w:num w:numId="7" w16cid:durableId="827526428">
+    <w:abstractNumId w:val="5"/>
+  </w:num>
+  <w:num w:numId="8" w16cid:durableId="1616986530">
     <w:abstractNumId w:val="6"/>
   </w:num>
-  <w:num w:numId="40" w16cid:durableId="651105259">
-    <w:abstractNumId w:val="5"/>
+  <w:num w:numId="9" w16cid:durableId="546525257">
+    <w:abstractNumId w:val="7"/>
+    <w:lvlOverride w:ilvl="0"/>
+    <w:lvlOverride w:ilvl="1"/>
+    <w:lvlOverride w:ilvl="2"/>
+    <w:lvlOverride w:ilvl="3"/>
+    <w:lvlOverride w:ilvl="4"/>
+    <w:lvlOverride w:ilvl="5"/>
+    <w:lvlOverride w:ilvl="6"/>
+    <w:lvlOverride w:ilvl="7"/>
+    <w:lvlOverride w:ilvl="8"/>
   </w:num>
-  <w:num w:numId="41" w16cid:durableId="1115100620">
-    <w:abstractNumId w:val="4"/>
-  </w:num>
-  <w:num w:numId="42" w16cid:durableId="1265577617">
-    <w:abstractNumId w:val="28"/>
-  </w:num>
-  <w:num w:numId="43" w16cid:durableId="1852795707">
-    <w:abstractNumId w:val="25"/>
-  </w:num>
-  <w:num w:numId="44" w16cid:durableId="119955429">
-    <w:abstractNumId w:val="41"/>
-  </w:num>
-  <w:num w:numId="45" w16cid:durableId="810632565">
-    <w:abstractNumId w:val="14"/>
-  </w:num>
-  <w:num w:numId="46" w16cid:durableId="523592130">
-    <w:abstractNumId w:val="23"/>
-  </w:num>
-  <w:num w:numId="47" w16cid:durableId="1163469455">
-    <w:abstractNumId w:val="34"/>
-  </w:num>
-  <w:num w:numId="48" w16cid:durableId="812334162">
-    <w:abstractNumId w:val="40"/>
-  </w:num>
-  <w:num w:numId="49" w16cid:durableId="827526428">
-    <w:abstractNumId w:val="22"/>
-  </w:num>
-  <w:num w:numId="50" w16cid:durableId="1616986530">
-    <w:abstractNumId w:val="31"/>
-  </w:num>
-  <w:numIdMacAtCleanup w:val="4"/>
+  <w:numIdMacAtCleanup w:val="9"/>
 </w:numbering>
 </file>
 
@@ -11571,7 +8890,7 @@
       <w:keepNext/>
       <w:keepLines/>
       <w:numPr>
-        <w:numId w:val="13"/>
+        <w:numId w:val="4"/>
       </w:numPr>
       <w:spacing w:before="180" w:after="60"/>
       <w:outlineLvl w:val="0"/>
@@ -11597,7 +8916,7 @@
       <w:keepNext/>
       <w:numPr>
         <w:ilvl w:val="1"/>
-        <w:numId w:val="13"/>
+        <w:numId w:val="4"/>
       </w:numPr>
       <w:spacing w:before="120" w:after="60"/>
       <w:outlineLvl w:val="1"/>
@@ -11621,7 +8940,7 @@
       <w:keepNext/>
       <w:numPr>
         <w:ilvl w:val="2"/>
-        <w:numId w:val="13"/>
+        <w:numId w:val="4"/>
       </w:numPr>
       <w:spacing w:before="120" w:after="120"/>
       <w:outlineLvl w:val="2"/>
@@ -11812,7 +9131,6 @@
   <w:style w:type="table" w:styleId="Grilledutableau">
     <w:name w:val="Table Grid"/>
     <w:basedOn w:val="TableauNormal"/>
-    <w:semiHidden/>
     <w:rsid w:val="00AE282D"/>
     <w:tblPr>
       <w:tblBorders>
@@ -12572,15 +9890,16 @@
 </file>
 
 <file path=customXml/item1.xml><?xml version="1.0" encoding="utf-8"?>
-<?mso-contentType ?>
-<FormTemplates xmlns="http://schemas.microsoft.com/sharepoint/v3/contenttype/forms">
-  <Display>DocumentLibraryForm</Display>
-  <Edit>DocumentLibraryForm</Edit>
-  <New>DocumentLibraryForm</New>
-</FormTemplates>
+<b:Sources xmlns:b="http://schemas.openxmlformats.org/officeDocument/2006/bibliography" xmlns="http://schemas.openxmlformats.org/officeDocument/2006/bibliography" SelectedStyle="\APA.XSL" StyleName="APA"/>
 </file>
 
 <file path=customXml/item2.xml><?xml version="1.0" encoding="utf-8"?>
+<p:properties xmlns:p="http://schemas.microsoft.com/office/2006/metadata/properties" xmlns:xsi="http://www.w3.org/2001/XMLSchema-instance" xmlns:pc="http://schemas.microsoft.com/office/infopath/2007/PartnerControls">
+  <documentManagement/>
+</p:properties>
+</file>
+
+<file path=customXml/item3.xml><?xml version="1.0" encoding="utf-8"?>
 <ct:contentTypeSchema xmlns:ct="http://schemas.microsoft.com/office/2006/metadata/contentType" xmlns:ma="http://schemas.microsoft.com/office/2006/metadata/properties/metaAttributes" ct:_="" ma:_="" ma:contentTypeName="Document" ma:contentTypeID="0x010100FBB99F57F4D89D439F52EDCD0CED316B" ma:contentTypeVersion="7" ma:contentTypeDescription="Crée un document." ma:contentTypeScope="" ma:versionID="7f146099027e1b74c82fbe61e090590b">
   <xsd:schema xmlns:xsd="http://www.w3.org/2001/XMLSchema" xmlns:xs="http://www.w3.org/2001/XMLSchema" xmlns:p="http://schemas.microsoft.com/office/2006/metadata/properties" xmlns:ns2="6b19550a-bdc3-4796-8096-c6911560d534" targetNamespace="http://schemas.microsoft.com/office/2006/metadata/properties" ma:root="true" ma:fieldsID="7044bf5f632aa66a3f32a70d04b92caa" ns2:_="">
     <xsd:import namespace="6b19550a-bdc3-4796-8096-c6911560d534"/>
@@ -12742,25 +10061,33 @@
 </ct:contentTypeSchema>
 </file>
 
-<file path=customXml/item3.xml><?xml version="1.0" encoding="utf-8"?>
-<p:properties xmlns:p="http://schemas.microsoft.com/office/2006/metadata/properties" xmlns:xsi="http://www.w3.org/2001/XMLSchema-instance" xmlns:pc="http://schemas.microsoft.com/office/infopath/2007/PartnerControls">
-  <documentManagement/>
-</p:properties>
-</file>
-
 <file path=customXml/item4.xml><?xml version="1.0" encoding="utf-8"?>
-<b:Sources xmlns:b="http://schemas.openxmlformats.org/officeDocument/2006/bibliography" xmlns="http://schemas.openxmlformats.org/officeDocument/2006/bibliography" SelectedStyle="\APA.XSL" StyleName="APA"/>
+<?mso-contentType ?>
+<FormTemplates xmlns="http://schemas.microsoft.com/sharepoint/v3/contenttype/forms">
+  <Display>DocumentLibraryForm</Display>
+  <Edit>DocumentLibraryForm</Edit>
+  <New>DocumentLibraryForm</New>
+</FormTemplates>
 </file>
 
 <file path=customXml/itemProps1.xml><?xml version="1.0" encoding="utf-8"?>
-<ds:datastoreItem xmlns:ds="http://schemas.openxmlformats.org/officeDocument/2006/customXml" ds:itemID="{6C3F7A66-EDE3-46FD-83EB-3C265E5D2669}">
+<ds:datastoreItem xmlns:ds="http://schemas.openxmlformats.org/officeDocument/2006/customXml" ds:itemID="{C8C35155-3E6A-4058-B6E4-303717845E3B}">
   <ds:schemaRefs>
-    <ds:schemaRef ds:uri="http://schemas.microsoft.com/sharepoint/v3/contenttype/forms"/>
+    <ds:schemaRef ds:uri="http://schemas.openxmlformats.org/officeDocument/2006/bibliography"/>
   </ds:schemaRefs>
 </ds:datastoreItem>
 </file>
 
 <file path=customXml/itemProps2.xml><?xml version="1.0" encoding="utf-8"?>
+<ds:datastoreItem xmlns:ds="http://schemas.openxmlformats.org/officeDocument/2006/customXml" ds:itemID="{2319CDB8-A2CD-412D-8359-13E6B4DF1FF4}">
+  <ds:schemaRefs>
+    <ds:schemaRef ds:uri="http://schemas.microsoft.com/office/2006/metadata/properties"/>
+    <ds:schemaRef ds:uri="http://schemas.microsoft.com/office/infopath/2007/PartnerControls"/>
+  </ds:schemaRefs>
+</ds:datastoreItem>
+</file>
+
+<file path=customXml/itemProps3.xml><?xml version="1.0" encoding="utf-8"?>
 <ds:datastoreItem xmlns:ds="http://schemas.openxmlformats.org/officeDocument/2006/customXml" ds:itemID="{75ED066B-A5C4-4F00-9682-79C6BF6A6E3B}">
   <ds:schemaRefs>
     <ds:schemaRef ds:uri="http://schemas.microsoft.com/office/2006/metadata/contentType"/>
@@ -12778,19 +10105,10 @@
 </ds:datastoreItem>
 </file>
 
-<file path=customXml/itemProps3.xml><?xml version="1.0" encoding="utf-8"?>
-<ds:datastoreItem xmlns:ds="http://schemas.openxmlformats.org/officeDocument/2006/customXml" ds:itemID="{2319CDB8-A2CD-412D-8359-13E6B4DF1FF4}">
+<file path=customXml/itemProps4.xml><?xml version="1.0" encoding="utf-8"?>
+<ds:datastoreItem xmlns:ds="http://schemas.openxmlformats.org/officeDocument/2006/customXml" ds:itemID="{6C3F7A66-EDE3-46FD-83EB-3C265E5D2669}">
   <ds:schemaRefs>
-    <ds:schemaRef ds:uri="http://schemas.microsoft.com/office/2006/metadata/properties"/>
-    <ds:schemaRef ds:uri="http://schemas.microsoft.com/office/infopath/2007/PartnerControls"/>
-  </ds:schemaRefs>
-</ds:datastoreItem>
-</file>
-
-<file path=customXml/itemProps4.xml><?xml version="1.0" encoding="utf-8"?>
-<ds:datastoreItem xmlns:ds="http://schemas.openxmlformats.org/officeDocument/2006/customXml" ds:itemID="{C8C35155-3E6A-4058-B6E4-303717845E3B}">
-  <ds:schemaRefs>
-    <ds:schemaRef ds:uri="http://schemas.openxmlformats.org/officeDocument/2006/bibliography"/>
+    <ds:schemaRef ds:uri="http://schemas.microsoft.com/sharepoint/v3/contenttype/forms"/>
   </ds:schemaRefs>
 </ds:datastoreItem>
 </file>
</xml_diff>